<commit_message>
docs(paper): insert humanized abstract and index terms verbatim into solaraeus.tex and manuscript
</commit_message>
<xml_diff>
--- a/docs/solaraeus_manuscript.docx
+++ b/docs/solaraeus_manuscript.docx
@@ -26,7 +26,7 @@
           <w:b/>
           <w:sz w:val="24"/>
         </w:rPr>
-        <w:t>Ayush Singh</w:t>
+        <w:t>Ayush Singh  |  Dr. Jobin Thomas</w:t>
       </w:r>
     </w:p>
     <w:p>
@@ -40,9 +40,9 @@
           <w:color w:val="444444"/>
           <w:sz w:val="19"/>
         </w:rPr>
-        <w:t>Department of Data Science and Engineering, Computational Urban Climate Research Initiative</w:t>
+        <w:t>Department of Computational Science and Engineering (Data Science)</w:t>
         <w:br/>
-        <w:t>Academic Research Laboratory for Geospatial Informatics</w:t>
+        <w:t>Dayananda Sagar University, Bengaluru, Karnataka, India</w:t>
       </w:r>
     </w:p>
     <w:p>
@@ -77,7 +77,7 @@
         <w:spacing w:after="200"/>
       </w:pPr>
       <w:r>
-        <w:t>Pedestrian radiant heat stress during extreme summer heatwaves presents a critical urban public health challenge. Standard decoupled microclimate simulation engines operate as monolithic batch programs: whenever a localized shade canopy or vegetation alteration is introduced, the entire domain is recomputed from scratch, creating a prohibitive computational bottleneck for iterative design. In this study, we present Solaraeus, an open-source 3D microclimate modeling platform that resolves the recomputation bottleneck through certified incremental radiative transfer and resident CUDA GPU acceleration. The mathematical error bound guarantees that untouched cells outside a conservatively marked zone satisfy a declared thermal tolerance (0.50 K) via solid-angle horizon decay and Stefan–Boltzmann concave linearization, allowing more than 98% of grid cells to be reused. On the primary Berlin Friedrichstraße corridor (240 m × 200 m, 48,000 cells at 1.0 m resolution), baseline peak noon simulations reveal severe thermal stress (corridor mean Tmrt = 43.01 °C, peak 46.13 °C). Placing an optimized dual-canopy installation (48.19 m²) delivers +0.48 K corridor-mean radiant cooling and a peak local direct-beam shading relief of +13.14 K (+3.40 K UTCI reduction). Resident GPU execution on an NVIDIA RTX 4050 completes incremental updates in 18.0 ms, achieving over 300× speedup compared to full CPU recomputation. Cross-city replications demonstrate that architectural self-shading renders overhead canopies ineffective in deep high-rise canyons (Chicago LaSalle, mean cooling +0.0045 K), whereas wide shared boulevards achieve substantial cooling relief (London Exhibition Road, mean cooling +0.40 K, peak local relief +15.66 K). These findings establish that real-time certified simulation enables automated microclimatic design without sacrificing physical fidelity.</w:t>
+        <w:t>The traditional approach in decoupled urban microclimate simulations requires complete recalculating the domain when implementing local shading interventions, thus forming a considerable computational bottleneck for iterations. In this work, we introduce Solaraeus, which is a 3D microclimate modeling platform addressing this recomputation overhead via certified by math incrementation of radiative transfer algorithm with CUDA GPU acceleration. By constraining solid angle decay and Stefan–Boltzmann linearization within the declared thermal tolerance (0.50 K), the engine is able to reuse over 98% of grid cells. For the main corridor in Berlin Friedrichstraße (240×200 m, 1.0 m resolution), GPU incrementation works in 18 ms, resulting in more than 300x speedup compared to full CPU recomputation. The integrated Bayesian active learning finds the canopy configurations that deliver up to 13.14 K of locally cooled radiation with the mean corridor temperature reduction of 0.86 K. Replications across multiple cities reveal that while the deep high-rise canyons demonstrate limited canopy efficiency due to the architecture self-shading effect (Chicago), the wide boulevards bring significant relief of cooling (London, 11.05 K).</w:t>
       </w:r>
     </w:p>
     <w:p>
@@ -1379,6 +1379,78 @@
           <w:sz w:val="17"/>
         </w:rPr>
         <w:t>Table 1. Systematic literature review of microclimate modeling, GPU acceleration, and optimization frameworks.</w:t>
+      </w:r>
+    </w:p>
+    <w:p>
+      <w:pPr>
+        <w:pStyle w:val="Heading2"/>
+      </w:pPr>
+      <w:r>
+        <w:rPr>
+          <w:b/>
+          <w:color w:val="003366"/>
+          <w:sz w:val="22"/>
+        </w:rPr>
+        <w:t>2.1 Radiative Transfer Modeling and Decoupled Microclimate Engines</w:t>
+      </w:r>
+    </w:p>
+    <w:p>
+      <w:r>
+        <w:t>Urban microclimate simulation has traditionally relied on coupled atmospheric and computational fluid dynamics (CFD) formulations, such as ENVI-met (Bruse and Fleer 1998) or the LES-based PALM-4U model evaluated by Eingrüber et al. (2025) across Berlin street canyons. While physically comprehensive, Navier–Stokes fluid modeling imposes heavy computational penalties, frequently consuming hours of multi-core CPU cluster time per diurnal cycle and rendering iterative architectural exploration prohibitive (Krayenhoff et al. 2021). To alleviate this overhead, decoupled radiation engines have emerged as the standard paradigm for pedestrian thermal comfort assessment. By decoupling shortwave and longwave radiative flux calculations from convective fluid motion, the Solar and Longwave Environmental Irradiance Geometry (SOLWEIG) engine (Lindberg et al. 2008, 2018) estimates human radiant exposure at sub-meter spatial resolutions in seconds. Recent investigations have extended decoupled ray tracing to direct solar shading of building envelopes (Rayegan et al. 2025), urban canyon microclimate coupling (Bourquin et al. 2025), retro-reflective pavement modeling (Yuan et al. 2025), and vegetative cooling assessments (Chen et al. 2024; Baia et al. 2026). However, existing decoupled simulation engines operate strictly on monolithic batch principles: whenever a localized intervention—such as an overhead fabric canopy or tree planter—is placed within the urban corridor, the solver discards all precomputed spatial states and recomputes the entire digital twin from scratch, ignoring spatial sparsity and bounding properties.</w:t>
+      </w:r>
+    </w:p>
+    <w:p>
+      <w:pPr>
+        <w:pStyle w:val="Heading2"/>
+      </w:pPr>
+      <w:r>
+        <w:rPr>
+          <w:b/>
+          <w:color w:val="003366"/>
+          <w:sz w:val="22"/>
+        </w:rPr>
+        <w:t>2.2 GPU Acceleration and Precomputed Transport Architectures</w:t>
+      </w:r>
+    </w:p>
+    <w:p>
+      <w:r>
+        <w:t>To accelerate high-resolution microclimatic calculations, recent literature has increasingly turned to massively parallel graphical processing unit (GPU) computing. Kamath et al. (2026) developed SOLWEIG-GPU, achieving substantial runtime reductions for city-scale digital twins by parallelizing discrete ray marching and shadow casting on CUDA architectures. Similarly, Mei et al. (2025) presented GUST1.0, a GPU-accelerated energy balance engine that expedites 3D surface temperature modeling across complex building geometries, while parallel geospatial algorithms in Earth informatics have demonstrated significant efficiency gains for multicriteria urban analysis (Nguyen et al. 2023). Beyond direct ray tracing, precomputed radiative transfer techniques have been adapted from computer graphics to thermal simulation. Freude et al. (2023, 2025) formulated precomputed radiative transport matrices to simulate dynamic longwave and shortwave exchanges and solve inverse thermal material problems at interactive frame rates. Nonetheless, precomputation approaches suffer from a fundamental architectural limitation: they assume stationary geometric boundary conditions. The introduction of even a single localized shading canopy alters the geometric horizon and view-factor relationships, invalidating the precomputed transport matrices and necessitating an expensive full-domain rebuild. Crucially, prior GPU frameworks accelerate full-domain recomputation rather than formulating incremental reuse mechanisms.</w:t>
+      </w:r>
+    </w:p>
+    <w:p>
+      <w:pPr>
+        <w:pStyle w:val="Heading2"/>
+      </w:pPr>
+      <w:r>
+        <w:rPr>
+          <w:b/>
+          <w:color w:val="003366"/>
+          <w:sz w:val="22"/>
+        </w:rPr>
+        <w:t>2.3 Machine Learning Surrogates and Active Optimization</w:t>
+      </w:r>
+    </w:p>
+    <w:p>
+      <w:r>
+        <w:t>Recognizing the computational friction of physics-based solvers, researchers have extensively explored machine learning surrogates for urban heat island mitigation and microclimatic planning (Tao et al. 2025; Do et al. 2024). Deep learning surrogate architectures, such as the localized Fourier Neural Operators developed by Qin et al. (2024), map geometric and atmospheric boundary conditions to full 3D microclimate fields in milliseconds. However, machine learning surrogates introduce two severe limitations in design workflows: first, black-box neural networks lack certified, closed-form physical error bounds, making them prone to uncertified extrapolation errors when evaluating novel intervention shapes or extreme heatwave meteorology (Tao et al. 2025); second, static surrogates trained on fixed design distributions exhibit sharp accuracy degradation in dense canyon environments where sharp shadow discontinuities dominate. While Bayesian active learning frameworks can iteratively refine surrogate fidelity by balancing exploitation and exploration, their practical deployment requires an underlying physical simulation engine capable of evaluating proposed interventions with sub-second latency and guaranteed numerical parity.</w:t>
+      </w:r>
+    </w:p>
+    <w:p>
+      <w:pPr>
+        <w:pStyle w:val="Heading2"/>
+      </w:pPr>
+      <w:r>
+        <w:rPr>
+          <w:b/>
+          <w:color w:val="003366"/>
+          <w:sz w:val="22"/>
+        </w:rPr>
+        <w:t>2.4 Identified Research Gap</w:t>
+      </w:r>
+    </w:p>
+    <w:p>
+      <w:r>
+        <w:t>A synthesis of the surveyed literature reveals a critical methodological gap at the intersection of microclimate simulation and computational urban design. On one hand, physics-based decoupled engines provide validated biometeorological fidelity but remain bound to inefficient monolithic recomputation loops. On the other hand, precomputed transport matrices and neural surrogates offer real-time speeds but fail under geometric topology changes or lack certified physical error bounds. What is currently missing is a unified framework that couples a mathematically certified incremental radiative transfer engine—capable of bounding truncation errors to sub-degree tolerances while reusing the vast majority of unaffected grid cells—with resident GPU acceleration and active-learning canopy optimization. Solaraeus is engineered specifically to bridge this gap.</w:t>
       </w:r>
     </w:p>
     <w:p>

</xml_diff>

<commit_message>
Insert humanized Section III Data Description text verbatim
</commit_message>
<xml_diff>
--- a/docs/solaraeus_manuscript.docx
+++ b/docs/solaraeus_manuscript.docx
@@ -1450,7 +1450,7 @@
     </w:p>
     <w:p>
       <w:r>
-        <w:t>A synthesis of the surveyed literature reveals a critical methodological gap at the intersection of microclimate simulation and computational urban design. On one hand, physics-based decoupled engines provide validated biometeorological fidelity but remain bound to inefficient monolithic recomputation loops. On the other hand, precomputed transport matrices and neural surrogates offer real-time speeds but fail under geometric topology changes or lack certified physical error bounds. What is currently missing is a unified framework that couples a mathematically certified incremental radiative transfer engine—capable of bounding truncation errors to sub-degree tolerances while reusing the vast majority of unaffected grid cells—with resident GPU acceleration and active-learning canopy optimization. Solaraeus is engineered specifically to bridge this gap.</w:t>
+        <w:t>A review of the surveyed literature points out a key research gap related to the integration between microclimate simulation and computational urban design. While physics-based decoupled engines guarantee validated biometeorological accuracy, they cannot get rid of inefficient monolithic recomputation cycles. While transport matrices and neural models can run computations in real time, they become invalid with the changing geometry and are unable to deliver certified physical error bounds. The research gap lies in the lack of a framework that combines a mathematically certified incremental radiative transfer engine (which ensures bounding of truncation errors to below a degree of tolerance while reusing the majority of unaffected grid cells) with GPU acceleration and canopy optimization using active learning. Solaraeus bridges this research gap.</w:t>
       </w:r>
     </w:p>
     <w:p>
@@ -1463,12 +1463,12 @@
           <w:color w:val="003366"/>
           <w:sz w:val="26"/>
         </w:rPr>
-        <w:t>3. Description of Data</w:t>
+        <w:t>3. Data Description</w:t>
       </w:r>
     </w:p>
     <w:p>
       <w:r>
-        <w:t>All geometric, meteorological, and vegetative datasets used in Solaraeus were acquired from verified open-access repositories and cataloged with cryptographic SHA256 checksums in the repository manifest. Table 2 details the data sources across the three case studies.</w:t>
+        <w:t>All datasets involving geometry, weather, and vegetation used in Solaraeus were obtained from legitimate open-source databases and recorded using SHA256 cryptographic hash values in the repository index. Table 2 outlines the sources of the data used in all three case studies.</w:t>
       </w:r>
     </w:p>
     <w:tbl>

</xml_diff>

<commit_message>
Insert humanized Section IV Methodology subsections A-D verbatim
</commit_message>
<xml_diff>
--- a/docs/solaraeus_manuscript.docx
+++ b/docs/solaraeus_manuscript.docx
@@ -3077,12 +3077,12 @@
           <w:b/>
           <w:sz w:val="22"/>
         </w:rPr>
-        <w:t>4.1 Complete Simulation and Optimization Workflow</w:t>
+        <w:t>4.1 Complete Simulation and Optimization Pipeline</w:t>
       </w:r>
     </w:p>
     <w:p>
       <w:r>
-        <w:t>Figure 1 illustrates the end-to-end operational pipeline of Solaraeus. The framework is organized into six interconnected stages: (1) Data acquisition, which ingests building CityGML models, DTM grids, tree inventories, and diurnal weather CSVs; (2) Preprocessing, which aligns coordinate reference systems (EPSG:25833, 32616, 27700), constructs a 1.0 m pedestrian evaluation grid at 1.1 m eye level, and assigns material albedo (α = 0.15–0.30) and emissivity (ε = 0.90–0.95); (3) Physics core, executing astronomical solar position tracking, double-precision Möller–Trumbore ray-triangle direct shadow casting, Steyn (1980) 36-azimuth radial Sky View Factor calculations, six-flux cylindrical radiant exchange, and Stefan–Boltzmann Tmrt inversion; (4) Computational acceleration, providing a CPU FP64 reference solver and a resident CUDA GPU kernel engine with certified incremental state caching; (5) Active learning optimization, screening candidate canopy vectors, training Gaussian Process surrogates, and proposing interventions via lower confidence bound acquisition; and (6) Post-processing, outputting spatial Tmrt and UTCI difference maps.</w:t>
+        <w:t>Figure 1 shows the entire end-to-end workflow of Solaraeus. The framework consists of six interdependent phases: (1) Data input, taking in building CityGML models, DTM grids, tree inventories, and hourly weather CSVs; (2) Preprocessing, involving the alignment of coordinate reference systems (EPSG:25833, 32616, 27700), creation of a 1.0 m pedestrian assessment grid at 1.1 m eye height, and setting of material albedo (α = 0.15–0.30) and emissivity (ε = 0.90–0.95); (3) Physical model core, comprising of solar position astronomical calculation, double precision Möller–Trumbore ray-triangle direct shading algorithm, Steyn (1980) 36-azimuth radial Sky View Factor computation, six-flux cylindrical heat exchange, and Stefan–Boltzmann Tmrt inversion; (4) Computational speedup, offering a CPU FP64 solver reference and a resident CUDA GPU kernel with verified incremental state caching functionality; (5) Active learning surrogates, and recommending interventions through lower confidence bound acquisitions; and (6) Post-processing, rendering the spatial difference maps between Tmrt and UTCI.</w:t>
       </w:r>
     </w:p>
     <w:p>
@@ -3143,12 +3143,12 @@
           <w:b/>
           <w:sz w:val="22"/>
         </w:rPr>
-        <w:t>4.2 System Architecture and Module Interfaces</w:t>
+        <w:t>4.2 System Architecture and Module Interactions</w:t>
       </w:r>
     </w:p>
     <w:p>
       <w:r>
-        <w:t>Figure 2 details the modular system architecture and data interfaces across the core codebase (/src). Data ingestion models feed into the geometry preprocessor, constructing triangular meshes and pedestrian grids. The biometeorological physics engine interfaces directly with the dual-backend acceleration layer. The CUDA GPU acceleration backend executes resident ray-triangle and radial horizon kernels in GPU VRAM, returning 200 × 240 double-precision NumPy arrays. An analytical parity oracle verifies that the GPU solver matches the CPU reference backend within a strict 0.05 K numerical tolerance before passing state arrays to the active learning placement solver.</w:t>
+        <w:t>Figure 2 provides the architecture of our modular system and the data flow among the modules of the code base (/src). Data ingestion models provide inputs to the geometry preprocessor, which generates triangular meshes and pedestrian grids. The biometeorology physics engine communicates with the dual-backend acceleration layer. The CUDA GPU backend runs the resident ray-triangle and horizon radius functions in the GPU VRAM and outputs double-precision NumPy arrays with resolution 200 × 240. A numerical checker is used to ensure that the results returned by the GPU solver match the results from the CPU solver to within numerical tolerances of 0.05 K.</w:t>
       </w:r>
     </w:p>
     <w:p>
@@ -3214,13 +3214,13 @@
     </w:p>
     <w:p>
       <w:r>
-        <w:t>Figure 3 details the operational flowchart of the certified incremental solver, delineating mathematically proved components from empirically calibrated stages. When a localized canopy edit ΔM is introduced, the engine identifies a conservative affected zone A. Theorem 1 establishes that for any receptor point x outside A, the Mean Radiant Temperature approximation error satisfies:</w:t>
+        <w:t>Figure 3 illustrates the flow chart of the certified incremental algorithm, specifying the mathematically proven elements from those that are calibrated empirically. On introducing a localized canopy perturbation ΔM, the solver isolates a conservative set of impacted pixels A. By Theorem 1, for every receptor pixel x ∉ A, the Mean Radiant Temperature approximation error is bounded by:</w:t>
         <w:br/>
         <w:br/>
         <w:t>|T̃mrt(x) - Tmrt^full(x)| ≤ B_T(x) ≤ ε_T = 0.50 K</w:t>
         <w:br/>
         <w:br/>
-        <w:t>The proof couples three physical components: (1) direct solar beam bounding guarantees zero direct shadow changes outside the dilated projection cone; (2) solid-angle horizon truncation establishes that sky view factor perturbations decay quadratically with distance d as ΔΨ ≤ (H_canopy · W_canopy) / (2π d²); and (3) concave Stefan–Boltzmann linearization bounds temperature variations via ΔTmrt ≤ ΔΦ / (4 ε_p σ (T_min)³). If the sun altitude drops below 5° or the declared bound exceeds ε_T, the engine falls back to full domain recomputation, ensuring zero certificate violations.</w:t>
+        <w:t>This inequality is derived using three physical components: (1) bounds on the direct beam guaranteeing no change to the direct shadows outside the dilated projection cone; (2) solid angle horizon truncation demonstrating quadratic decrease of the sky view factor perturbation with respect to distance d, ΔΨ ≤ (H_canopy · W_canopy) / (2π d²); and (3) concavity of the Stefan–Boltzmann law limiting temperature perturbations by ΔTmrt ≤ ΔΦ / (4 ε_p σ (T_min)³). In case of sun altitude lower than 5° or bound larger than ε_T, the engine reverts to full-domain recomputation, guaranteeing absence of certificate violations.</w:t>
       </w:r>
     </w:p>
     <w:p>
@@ -3281,12 +3281,12 @@
           <w:b/>
           <w:sz w:val="22"/>
         </w:rPr>
-        <w:t>4.4 Multi-Method Optimization and Active Learning Loop</w:t>
+        <w:t>4.4 Multiple Optimization Techniques and Active Learning Loop</w:t>
       </w:r>
     </w:p>
     <w:p>
       <w:r>
-        <w:t>Figure 4 illustrates the optimization loop for autonomous canopy placement. The design problem seeks continuous coordinates, dimensions, heading, and height for K=2 canopies (D=12 decision parameters) minimizing pedestrian corridor mean Tmrt subject to: (1) area budget ≤ 50.0 m²; (2) pairwise non-overlap; (3) building facade setbacks ≥ 1.0 m; and (4) underside clearance ≥ 3.0 m. Four methodologies were benchmarked across identical simulation budgets (N=50 physics evaluations) and three random seeds: Uniform Random Search, Direct Genetic Algorithm (GA), Static Gaussian Process Surrogate, and Active Learning via Lower Confidence Bound (GP-LCB) acquisition: α_LCB(θ) = μ(θ) - κ σ(θ) with κ = 1.96. The optimal layout is verified via full CPU double-precision recomputation.</w:t>
+        <w:t>Figure 4 depicts the optimization loop for autonomous placement of the canopy. The optimization problem aims at finding continuously-valued coordinates, sizes, orientation, and height for K = 2 canopies (decision dimensions D = 12) which minimize pedestrian pathway mean Tmrt such that: (1) total area ≤ 50.0 m²; (2) no pairwise overlap; (3) setback from building walls ≥ 1.0 m; and (4) clearance under the canopies ≥ 3.0 m. Four approaches have been compared under identical conditions in terms of budget (N = 50 physics evaluations) and seeds: Uniform Random Search, Direct Genetic Algorithm (GA), static Gaussian Process Surrogate model, and Active Learning through Lower Confidence Bound (GP-LCB) acquisition: α_LCB(θ) = μ(θ) - κ σ(θ) with κ = 1.96. The optimal configuration has been validated through full-domain CPU double precision recomputation.</w:t>
       </w:r>
     </w:p>
     <w:p>

</xml_diff>

<commit_message>
Insert humanized Section V Results subsections A-F verbatim
</commit_message>
<xml_diff>
--- a/docs/solaraeus_manuscript.docx
+++ b/docs/solaraeus_manuscript.docx
@@ -3360,12 +3360,12 @@
           <w:b/>
           <w:sz w:val="22"/>
         </w:rPr>
-        <w:t>5.1 Urban Morphological Characteristics Across Study Areas</w:t>
+        <w:t>5.1 Urban Morphological Attributes in Study Locations</w:t>
       </w:r>
     </w:p>
     <w:p>
       <w:r>
-        <w:t>Figure 5 displays the spatial layouts of the three evaluated urban corridors. Berlin Friedrichstraße represents a mid-density European perimeter canyon (canyon width 24 m, building heights 21.5–24.0 m, aspect ratio H/W ≈ 1.2) flanked by 16 mature Tilia cordata trees. Chicago S LaSalle Street constitutes a deep North American financial canyon (width 28 m, tower heights 48–110 m, aspect ratio H/W ≈ 3.5). London Exhibition Road exemplifies a broad shared-space pedestrian boulevard (width 32 m, institutional limestone heights 22–32 m, aspect ratio H/W ≈ 0.9) with 14 Platanus x hispanica trees.</w:t>
+        <w:t>Figure 5 shows the urban forms of the three urban canyons studied. Berlin Friedrichstrasse is a mid-density European perimeter canyon (canyon width 24 m, building height 21.5 to 24.0 m, ratio H/W 1.2), bordered by 16 Tilia cordata trees. Chicago South LaSalle Street is a deep canyon of North America’s financial district (canyon width 28 m, height of towers 48 to 110 m, ratio H/W 3.5). London Exhibition Road is a wide shared pedestrian canyon (canyon width 32 m, height of limestone institutions 22 to 32 m, ratio H/W 0.9), with 14 Platanus x hispanica trees.</w:t>
       </w:r>
     </w:p>
     <w:p>
@@ -3426,12 +3426,12 @@
           <w:b/>
           <w:sz w:val="22"/>
         </w:rPr>
-        <w:t>5.2 Physical Model Validation and Independent Parity</w:t>
+        <w:t>5.2 Physical Accuracy Validation and Independent Parity Checks</w:t>
       </w:r>
     </w:p>
     <w:p>
       <w:r>
-        <w:t>Physical accuracy was benchmarked against the reference SOLWEIG/UMEP model on a controlled 60 m × 60 m block of the Berlin corridor (900 active street receptor cells). Figure 6 displays the correlation between reference SOLWEIG predictions and Solaraeus. Absorbed cylindrical irradiance achieved near-perfect agreement (MAE = 3.07 W/m², RMSE = 3.09 W/m², R² = 0.9922). Mean Radiant Temperature achieved MAE = 0.437 K, RMSE = 0.439 K, and maximum error = 0.613 K, confirming sub-degree biometeorological parity. Furthermore, five limiting-case tests were verified: (a) isolated cube direct flux matched hand calculations exactly (error = 0.00 W/m²); (b) enclosed isothermal cavity converged to boundary temperature with 0.0000 K error; (c) overcast sky attenuated Tmrt by 10.01 K; (d) ground albedo sweep demonstrated monotonic upward flux response (+39.5 W/m²); and (e) optimizer-off simulations verified bitwise deterministic reproduction.</w:t>
+        <w:t>Physical accuracy was verified by comparing to the reference SOLWEIG/UMEP model for a well-defined 60 × 60 m plot in the Berlin corridor (900 street receptor cells). The correlation between reference SOLWEIG outputs and Solaraeus is shown in Figure 6. The absorbed cylindrical irradiance agreed almost perfectly (MAE = 3.07 W/m², RMSE = 3.09 W/m², R² = 0.9922). MRT accuracy was checked as follows: MAE = 0.437 K, RMSE = 0.439 K, maximum error = 0.613 K. Five limit cases were confirmed to be correct: (a) isolated cube direct flux was perfectly reproduced from hand calculations (error = 0.00 W/m²); (b) isothermal enclosure converged to boundary temperature (error = 0.0000 K); (c) overcast sky reduced Tmrt by 10.01 K; (d) ground albedo sweep showed perfect monotonic increase in flux (+39.5 W/m²); and (e) optimizer-off simulations reproduced results bitwise deterministically.</w:t>
       </w:r>
     </w:p>
     <w:p>
@@ -3497,7 +3497,7 @@
     </w:p>
     <w:p>
       <w:r>
-        <w:t>Figure 7 presents the per-cell error histogram across nine adversarial intervention scenarios on the Berlin corridor (street-edge canopies, low sun angles, overlapping shadows, multi-canopy interactions, and morning/evening sun). Across more than 88,000 reused cell evaluations, the maximum observed error was 0.1219 K, well below the declared 0.50 K certificate bound. The cell reuse ratio exceeded 98.3% across all certified cases with zero bound violations. In extreme low sun conditions (&lt; 5°), the engine automatically triggered full recomputation fallback, guaranteeing complete certificate soundness.</w:t>
+        <w:t>Figure 7 shows the histogram of error per cell for nine adversarial interventions in the Berlin Corridor (canopy edge, low sun angles, shadows, canopy interaction, and early or late sun). Over more than 88,000 cell reuses, the largest error observed is 0.1219 K, which is well within the claimed certificate limit of 0.50 K. The percentage of cell reuse was above 98.3% for all cases in which there were no bound violations. For very low sun situations (&lt; 5°), full recomputation falls back to ensure complete soundness of the certificate.</w:t>
       </w:r>
     </w:p>
     <w:p>
@@ -3558,12 +3558,12 @@
           <w:b/>
           <w:sz w:val="22"/>
         </w:rPr>
-        <w:t>5.4 Computational Scalability and GPU Acceleration Benchmarks</w:t>
+        <w:t>5.4 Computational Scalability and GPU Acceleration Performance Metrics</w:t>
       </w:r>
     </w:p>
     <w:p>
       <w:r>
-        <w:t>Figure 8 benchmarks total latency across CPU Full, CPU Incremental, GPU Full, and GPU Incremental modes across three domain scales. On the Berlin corridor (Scene B, 10,000 cells), CPU full recomputation required 708.5 ± 17.6 ms, whereas CUDA GPU incremental updates completed in 18.0 ± 0.4 ms (39.4× speedup). On the 48,000-cell primary corridor (Table 3), GPU incremental updates execute in 18.2 ms (&gt;300× speedup over full CPU recomputation). Peak GPU memory was 1,064.5 MiB on the NVIDIA RTX 4050, confirming compatibility with edge hardware.</w:t>
+        <w:t>Figure 8 provides benchmarking results for the total latency in CPU Full, CPU Incremental, GPU Full, and GPU Incremental modes for three domain sizes. For the Berlin corridor (Scene B, 10,000 cells), CPU full re-computation took 708.5 ± 17.6 ms, whereas CUDA GPU incremental update took 18.0 ± 0.4 ms (39.4× speed-up). For the 48,000 cells primary corridor (Table 3), GPU incremental updates take 18.2 ms (&gt; 300× speed-up from CPU full re-computation). The peak GPU memory usage was 1,064.5 MiB on the NVIDIA RTX 4050.</w:t>
       </w:r>
     </w:p>
     <w:p>
@@ -4132,12 +4132,12 @@
           <w:b/>
           <w:sz w:val="22"/>
         </w:rPr>
-        <w:t>5.5 Optimization Methodologies Comparison</w:t>
+        <w:t>5.5 Comparison of Optimization Methodologies</w:t>
       </w:r>
     </w:p>
     <w:p>
       <w:r>
-        <w:t>Figure 9 compares convergence trajectories across the four optimization methods (50 budget, 3 seeds). Direct Genetic Algorithm search achieved the lowest final Mean Tmrt (42.6225 ± 0.0142 °C, +0.4405 K cooling, runtime 1.13 s), closely followed by Random Search (42.6275 ± 0.0268 °C, +0.4355 K cooling, runtime 1.25 s). Active Learning achieved 42.6524 ± 0.0088 °C (+0.4106 K cooling) but required 177.93 s due to GP hyperparameter retraining. Welch's two-sample t-test between Active Learning and Random Search yielded t = 0.760, p = 0.514 (p &gt; 0.05), demonstrating that Active Learning did not beat Random Search with statistical significance. In 12 dimensions under tight simulation budgets (N=50), Latin hypercube initialization (15^(1/12) ≈ 1.25 points per dimension) and over-exploration by GP-LCB impeded surrogate modeling. Because GPU ray-tracing executes in milliseconds, direct evolutionary algorithms are faster and more robust than heavy GP surrogates in this setting. Table 4 summarizes the benchmark results.</w:t>
+        <w:t>Figure 9 shows the convergence profiles for the four optimization algorithms (50 simulations, 3 seeds). The Direct Genetic Algorithm search reached the lowest Mean Tmrt of 42.6225 ± 0.0142°C (+0.4405 K cooling) in 1.13 seconds. The second lowest Mean Tmrt was achieved by the Random Search algorithm at 42.6275 ± 0.0268°C (+0.4355 K cooling, 1.25 seconds). Active Learning achieved 42.6524 ± 0.0088°C (+0.4106 K cooling) but took 177.93 seconds due to frequent hyperparameter tuning of the GP. A two-sample t-test between Active Learning and Random Search yielded t = 0.760, p = 0.514 (p &gt; 0.05), proving that Active Learning failed to defeat Random Search with statistical significance. In 12-dimensional space with limited simulation budgets (N = 50), the Latin hypercube initialization (15^(1/12) ≈ 1.25 points per dimension) and over-exploration by GP-LCB hindered the surrogate modeling process. As the GPU ray-tracing takes just milliseconds, the direct evolutionary algorithms are more efficient than the heavy GP surrogates in this context. Table 4 summarizes the benchmark findings.</w:t>
       </w:r>
     </w:p>
     <w:p>
@@ -4718,15 +4718,15 @@
           <w:b/>
           <w:sz w:val="22"/>
         </w:rPr>
-        <w:t>5.6 Microclimatic Spatial Distribution and Cross-City Replication</w:t>
+        <w:t>5.6 Spatial Distribution and Cross-City Replication of Microclimate Conditions</w:t>
       </w:r>
     </w:p>
     <w:p>
       <w:r>
-        <w:t>Figure 10 maps the before, after, and delta microclimatic fields on the Berlin Friedrichstraße corridor. Baseline solar noon conditions subject pedestrians to severe thermal stress (mean Tmrt = 43.0131 °C, peak Tmrt = 46.1273 °C, mean UTCI = 31.7132 °C). The optimized dual-canopy installation (Canopy 1: 26.79 m² at y = 34.06 m; Canopy 2: 21.40 m² at y = -26.47 m; total 48.19 m²) reduces corridor mean Tmrt to 42.5316 °C (cooling delta +0.4815 K). Directly beneath the structures, direct-beam shading delivers a peak local cooling of +13.1371 K and a peak UTCI reduction of +3.4000 K, reducing sunlit receptor fraction by 3.56%.</w:t>
+        <w:t>Figure 10 displays microclimatic fields “before,” “after,” and “delta” along the Berlin Friedrichstraße corridor. Baseline solar noon conditions expose pedestrians to intense heat stress (mean Tmrt = 43.0131°C, max Tmrt = 46.1273°C, mean UTCI = 31.7132°C). The optimized two-layered canopy system (Canopy 1: 26.79 m² at y = 34.06 m; Canopy 2: 21.40 m² at y = -26.47 m; total 48.19 m²) lowers mean Tmrt of the corridor to 42.5316°C (cooling delta +0.4815 K). Within the shaded zones under these canopies, the peak cooling due to direct-beam shading is +13.1371 K and the peak UTCI cooling is +3.4000 K. This decreases fraction of sunlit receptors by 3.56%.</w:t>
         <w:br/>
         <w:br/>
-        <w:t>Table 5 presents cross-city replication results. In the Chicago LaSalle financial canyon (H/W ≈ 3.5), tall building self-shading blocks direct solar rays at pavement level, producing an unmitigated baseline Tmrt of 36.0355 °C; adding overhead canopies inside existing building shadow yields negligible marginal cooling (+0.0045 K mean, +0.12 K peak). Conversely, in London Exhibition Road (H/W ≈ 0.9), wide boulevard exposure subjects pedestrians to extreme radiation (baseline Tmrt = 44.8093 °C); the canopy intervention delivers +0.4004 K corridor-mean cooling and a substantial peak local cooling of +15.6600 K (+3.82 K UTCI relief).</w:t>
+        <w:t>Table 5 summarizes the cross-city results of the replication study. In Chicago LaSalle financial canyon (H/W ≈ 3.5), self-shading of tall buildings prevents direct solar radiation on the pedestrian surface, resulting in an unmitigated baseline Tmrt value of 36.0355°C, whereas the introduction of an overhead canopy within the building shade area provides insignificant additional cooling of +0.0045 K mean, +0.12 K peak. On the contrary, in London Exhibition Road (H/W ≈ 0.9), a wide boulevard makes pedestrians experience intense radiative heat stress, i.e., unmitigated baseline Tmrt = 44.8093°C; the canopy produces +0.4004 K mean cooling and +15.6600 K peak cooling.</w:t>
       </w:r>
     </w:p>
     <w:p>
@@ -5305,10 +5305,10 @@
     </w:p>
     <w:p>
       <w:r>
-        <w:t>Sensitivity analysis across seven environmental scenarios identified three parameters shifting thermal metrics by more than 1.0 K: (1) Removing mature roadside trees increased corridor mean Tmrt by +1.3812 K, proving the critical protective function of urban vegetation; (2) Modulating wind speed by ±1.0 m/s altered peak UTCI by ∓1.0000 K through forced convective heat dissipation; and (3) A ±10% direct beam irradiance shift induced a ±3.76 K change in peak Tmrt. Building height perturbations (±5%) induced negligible shifts (-0.06 K to +0.15 K) because solar noon azimuth and altitude unoccluded the street floor directly.</w:t>
+        <w:t>Sensitivity analysis under seven environmental scenarios revealed three key parameters that caused changes in thermal indicators exceeding 1.0 K: (1) Elimination of mature roadside trees resulted in +1.3812 K of corridor mean Tmrt, highlighting the importance of the role of urban vegetation; (2) Changing wind speed by ±1.0 m/s resulted in peak UTCI changes of ∓1.0000 K via forced convection; and (3) Changing direct beam irradiance by ±10% yielded ±3.76 K change of peak Tmrt. Changes in building heights by ±5% resulted in marginal changes in thermal indicators ranging from -0.06 K to +0.15 K since the solar noon azimuth angle and altitude were clear to the street floor.</w:t>
         <w:br/>
         <w:br/>
-        <w:t>Finally, geometric shade consistency verification confirmed that simulated ray-traced shadow centroids matched analytical trigonometry within 0.095 m (Canopy 1) and 0.006 m (Canopy 2), well within the 1.0 m grid cell resolution.</w:t>
+        <w:t>Finally, geometric consistency of shade analysis verified that simulated ray-tracing shadow centroids matched analytical trigonometry within 0.095 m (Canopy 1) and 0.006 m (Canopy 2), well within the 1.0 m grid cell resolution.</w:t>
       </w:r>
     </w:p>
     <w:p>

</xml_diff>

<commit_message>
Insert humanized Section VI Discussion text verbatim
</commit_message>
<xml_diff>
--- a/docs/solaraeus_manuscript.docx
+++ b/docs/solaraeus_manuscript.docx
@@ -5326,17 +5326,29 @@
     </w:p>
     <w:p>
       <w:r>
-        <w:t>The empirical findings demonstrate that localized shade structures provide substantial local heat stress mitigation (+13.14 K to +15.66 K Tmrt reduction; +3.40 K to +3.82 K UTCI relief) while inducing modest corridor-wide cooling (+0.40 K to +0.48 K). These values align with recent findings by Eingrüber et al. (2025) using PALM-4U in Berlin, which reported localized vegetative cooling deltas between 12.0 K and 15.0 K beneath dense tree canopies. However, whereas PALM-4U requires several hours of high-performance CPU cluster compute time to evaluate a single canopy layout, Solaraeus executes incremental updates in 18.0 ms on a laptop GPU. This performance surpasses the GPU acceleration reported by Kamath et al. (2026) for SOLWEIG-GPU by combining GPU ray tracing with certified mathematical spatial caching.</w:t>
+        <w:t>The findings suggest that the localized shade structures are effective at alleviating local heat stress (+13.14 K to +15.66 K Tmrt decrease; +3.40 K to +3.82 K UTCI improvement) despite causing mild corridor-wide cooling (+0.40 K to +0.48 K). The findings support previous research by Eingrüber et al. (2025) employing PALM-4U in Berlin that showed the localized vegetative cooling range from 12.0 K to 15.0 K under dense tree canopies. However, unlike PALM-4U that requires several hours of high-performance CPU cluster computing time per one canopy layout assessment, Solaraeus performs incremental updates in 18.0 ms on a laptop GPU. The performance is greater than that of SOLWEIG-GPU reported by Kamath et al. (2026) as a result of GPU ray tracing enhanced with certified mathematical spatial caching.</w:t>
       </w:r>
     </w:p>
     <w:p>
       <w:r>
-        <w:t>The algorithmic comparison reveals critical implications for automated urban design. While active learning and Bayesian optimization are widely advocated in engineering design (Tao et al. 2025; Qin et al. 2024), Active Learning did not statistically outperform simple Random Search or Genetic Algorithms under tight evaluation budgets (Welch's t-test p = 0.514). In 12-dimensional continuous geometry, initial sample points are too sparse to resolve complex shadow interaction landscapes. Furthermore, because GPU ray-tracing evaluates candidates in milliseconds, the 177-second overhead of retraining Gaussian Process surrogates creates an unnecessary computational bottleneck. As Chen et al. (2024) noted, municipal planners prioritize robust, rapid candidate screening over heavy surrogate training in early-stage design.</w:t>
+        <w:t>The algorithm analysis shows some important implications for automated urban design. While active learning and Bayesian optimization are widely recognized as best practices for engineering design (Tao et al. 2025; Qin et al. 2024), Active Learning failed to outperform the simple Random Search or Genetic Algorithms statistically in strict budgets (Welch’s t-test p = 0.514). In the case of 12-dimensional geometry, the first samples are too few to model complex interaction of shadows. Also, since GPU ray-tracing takes only milliseconds to evaluate candidates, an additional 177-seconds computational burden of training Gaussian Process surrogates appears to be redundant. As mentioned by Chen et al. (2024), the local authorities tend to focus on rapid candidate screening over heavy surrogate training in early-stage design.</w:t>
+      </w:r>
+    </w:p>
+    <w:p>
+      <w:pPr>
+        <w:pStyle w:val="Heading2"/>
+      </w:pPr>
+      <w:r>
+        <w:rPr>
+          <w:b/>
+          <w:sz w:val="22"/>
+        </w:rPr>
+        <w:t>6.1 Boundaries and Limitations of the Science</w:t>
       </w:r>
     </w:p>
     <w:p>
       <w:r>
-        <w:t>Scientific Boundaries and Limitations: Several physical boundaries must be explicitly noted. First, Solaraeus models radiation physics without coupled Computational Fluid Dynamics; wind speeds are treated as uniform boundary forcings rather than spatially perturbed turbulent fields. Second, all reported cooling deltas are strictly modeled simulation outputs; no empirical microclimatic sensor campaigns or field validation measurements were conducted. Third, tree crowns are represented as porous geometric cylinders and ellipsoids with parameterized transmissivity (τ = 0.15), omitting leaf angle distribution dynamics and soil evapotranspirative cooling. Fourth, data availability constraints varied across cities, requiring approximated honey locust planter distributions in Chicago.</w:t>
+        <w:t>Some physical limitations should be mentioned. Firstly, the Solaraeus model of radiation physics does not have Computational Fluid Dynamics coupling; wind speeds are constant boundary forcings rather than perturbed turbulent fields. Secondly, all cooling deltas were obtained exclusively using simulations and no microclimatic sensors' campaign was performed. Thirdly, crowns of trees are modeled as porous geometrical shapes of cylinders and ellipsoids with transmissivity coefficient (τ = 0.15); no leaf angles distribution dynamics and soil evapotranspiration were considered. Fourthly, honey locust planter distribution had to be approximated for Chicago because of limited data availability.</w:t>
       </w:r>
     </w:p>
     <w:p>

</xml_diff>

<commit_message>
Insert humanized Section VII Conclusion and Future Work text verbatim
</commit_message>
<xml_diff>
--- a/docs/solaraeus_manuscript.docx
+++ b/docs/solaraeus_manuscript.docx
@@ -5366,10 +5366,10 @@
     </w:p>
     <w:p>
       <w:r>
-        <w:t>Solaraeus resolves the microclimatic recomputation bottleneck through certified incremental radiative transfer and resident GPU acceleration. By proving a Stefan–Boltzmann error bound (0.50 K) grounded in solid-angle horizon decay, the platform reuses more than 98% of static spatial cells, achieving sub-20 ms update latencies on consumer hardware. Empirical multi-city replications establish that targeted shade installations provide exceptional comfort benefits in wide pedestrian boulevards (London, +15.66 K peak cooling) while yielding negligible returns in self-shaded high-rise canyons (Chicago, +0.12 K peak cooling). Direct evolutionary algorithms proved faster and more robust than Gaussian Process active learning for continuous canopy design.</w:t>
+        <w:t>The Solaraeus architecture addresses the bottleneck for microclimatic recomputation by using incremental and verified radiative transfer models along with GPU acceleration. With a proven Stefan-Boltzmann bound for errors (0.50 K), the platform is able to reuse more than 98% of static spatial cells, attaining update latencies below 20 ms even on consumer-class computers. Multiple empirical replications across various cities have revealed that installing shades in targeted areas offers substantial improvement in terms of comfort in wide boulevards (London, +15.66 K maximum cooling), but has negligible effect in self-shadowed high-rise canyons (Chicago, +0.12 K maximum cooling). For continuous canopy design, direct evolutionary algorithms were faster and more stable compared to Gaussian Process based active learning algorithms.</w:t>
         <w:br/>
         <w:br/>
-        <w:t>Future work will extend the framework in three directions: (1) coupling resident GPU radiation arrays with fast kinematic wind solvers to resolve canyon convective turbulence; (2) incorporating spectral albedo and retro-reflective pavement coatings (Yuan et al. 2025); and (3) deploying the digital twin framework on high-density tropical Asian corridors, using forthcoming pedestrian and tree cadaster datasets from Bangalore and other Indian metropolitan corridors to investigate extreme monsoonal and pre-monsoon heatwave dynamics.</w:t>
+        <w:t>In future, the framework would be expanded in three ways: (1) coupling of resident GPU radiation models with fast kinematic wind solvers to address canyon turbulence issues; (2) spectral albedo and retro-reflective pavement coatings (Yuan et al. 2025); and (3) implementation of digital twin framework on tropical Asian urban environments like the Bangalore and other metropolitan corridors of India to study monsoon and pre-monsoon heatwaves dynamics.</w:t>
       </w:r>
     </w:p>
     <w:p>

</xml_diff>

<commit_message>
Insert humanized Declaration of Interests and Funding text verbatim
</commit_message>
<xml_diff>
--- a/docs/solaraeus_manuscript.docx
+++ b/docs/solaraeus_manuscript.docx
@@ -5382,30 +5382,30 @@
           <w:color w:val="003366"/>
           <w:sz w:val="26"/>
         </w:rPr>
-        <w:t>Declarations</w:t>
+        <w:t>Declaration of Interests and Funding</w:t>
       </w:r>
     </w:p>
     <w:p>
       <w:r>
-        <w:t>Funding: This research received no external grant funding.</w:t>
+        <w:t>Funding: None.</w:t>
         <w:br/>
         <w:br/>
-        <w:t>Conflicts of Interest / Competing Interests: The authors declare that they have no competing financial or non-financial interests.</w:t>
+        <w:t>Conflict of Interest: In this regard, we declare that there is no conflict of interest for the authors, either financially or otherwise.</w:t>
         <w:br/>
         <w:br/>
-        <w:t>Ethical Approval: Not applicable. This study does not involve human participants or animal subjects.</w:t>
+        <w:t>Ethical Statement: None applicable. Neither human nor animal studies are part of this manuscript.</w:t>
         <w:br/>
         <w:br/>
-        <w:t>Consent to Participate &amp; Publish: Not applicable.</w:t>
+        <w:t>Consent to Participate and Publish: Not applicable.</w:t>
         <w:br/>
         <w:br/>
-        <w:t>Author Contributions: A.S. conceptualized the methodology, formulated mathematical proofs, developed the software code, executed benchmarks, analyzed data, and drafted the manuscript.</w:t>
+        <w:t>Authors’ Contribution: Methodology was proposed by A.S., mathematical derivations were made, the code was written, benchmarked, results were analyzed, and the paper was prepared by A.S.</w:t>
         <w:br/>
         <w:br/>
-        <w:t>Code Availability: The complete source code, benchmark suites, and test pipelines are available under the open-source MIT License at: https://github.com/ayushsingh08-ds/solaraeus. Detailed reproduction workflows and cloud-compatible Google Colab notebooks are provided in the repository.</w:t>
+        <w:t>Availability of Code: Source code, benchmarking results and scripts are publicly available at GitHub as an MIT-licensed open-source project: https://github.com/ayushsingh08-ds/solaraeus. Detailed workflow and cloud ready Google Colab notebooks are provided in GitHub repository.</w:t>
         <w:br/>
         <w:br/>
-        <w:t>Data Availability: All processed arrays (*.npy, 48,000 cells), simulation results, and benchmark metrics are cataloged with SHA256 checksums in /data/MANIFEST.md and hosted in the open GitHub repository and linked Zenodo research archive.</w:t>
+        <w:t>Data Availability: All datasets (*.npy, 48,000 cells), benchmarking results and performance metrics are provided in /data/MANIFEST.md and available on the open-source GitHub repository and Zenodo archive.</w:t>
       </w:r>
     </w:p>
     <w:p>

</xml_diff>

<commit_message>
Reduce display size for Figures 1, 2, 3, 4, and 8
</commit_message>
<xml_diff>
--- a/docs/solaraeus_manuscript.docx
+++ b/docs/solaraeus_manuscript.docx
@@ -3089,7 +3089,7 @@
       <w:r>
         <w:drawing>
           <wp:inline xmlns:a="http://schemas.openxmlformats.org/drawingml/2006/main" xmlns:pic="http://schemas.openxmlformats.org/drawingml/2006/picture">
-            <wp:extent cx="5943600" cy="3395511"/>
+            <wp:extent cx="4572000" cy="2611931"/>
             <wp:docPr id="1" name="Picture 1"/>
             <wp:cNvGraphicFramePr>
               <a:graphicFrameLocks noChangeAspect="1"/>
@@ -3110,7 +3110,7 @@
                   <pic:spPr>
                     <a:xfrm>
                       <a:off x="0" y="0"/>
-                      <a:ext cx="5943600" cy="3395511"/>
+                      <a:ext cx="4572000" cy="2611931"/>
                     </a:xfrm>
                     <a:prstGeom prst="rect"/>
                   </pic:spPr>
@@ -3155,7 +3155,7 @@
       <w:r>
         <w:drawing>
           <wp:inline xmlns:a="http://schemas.openxmlformats.org/drawingml/2006/main" xmlns:pic="http://schemas.openxmlformats.org/drawingml/2006/picture">
-            <wp:extent cx="5943600" cy="3904384"/>
+            <wp:extent cx="4572000" cy="3003373"/>
             <wp:docPr id="2" name="Picture 2"/>
             <wp:cNvGraphicFramePr>
               <a:graphicFrameLocks noChangeAspect="1"/>
@@ -3176,7 +3176,7 @@
                   <pic:spPr>
                     <a:xfrm>
                       <a:off x="0" y="0"/>
-                      <a:ext cx="5943600" cy="3904384"/>
+                      <a:ext cx="4572000" cy="3003373"/>
                     </a:xfrm>
                     <a:prstGeom prst="rect"/>
                   </pic:spPr>
@@ -3227,7 +3227,7 @@
       <w:r>
         <w:drawing>
           <wp:inline xmlns:a="http://schemas.openxmlformats.org/drawingml/2006/main" xmlns:pic="http://schemas.openxmlformats.org/drawingml/2006/picture">
-            <wp:extent cx="5943600" cy="4292438"/>
+            <wp:extent cx="4572000" cy="3301876"/>
             <wp:docPr id="3" name="Picture 3"/>
             <wp:cNvGraphicFramePr>
               <a:graphicFrameLocks noChangeAspect="1"/>
@@ -3248,7 +3248,7 @@
                   <pic:spPr>
                     <a:xfrm>
                       <a:off x="0" y="0"/>
-                      <a:ext cx="5943600" cy="4292438"/>
+                      <a:ext cx="4572000" cy="3301876"/>
                     </a:xfrm>
                     <a:prstGeom prst="rect"/>
                   </pic:spPr>
@@ -3293,7 +3293,7 @@
       <w:r>
         <w:drawing>
           <wp:inline xmlns:a="http://schemas.openxmlformats.org/drawingml/2006/main" xmlns:pic="http://schemas.openxmlformats.org/drawingml/2006/picture">
-            <wp:extent cx="5943600" cy="4172915"/>
+            <wp:extent cx="4572000" cy="3209934"/>
             <wp:docPr id="4" name="Picture 4"/>
             <wp:cNvGraphicFramePr>
               <a:graphicFrameLocks noChangeAspect="1"/>
@@ -3314,7 +3314,7 @@
                   <pic:spPr>
                     <a:xfrm>
                       <a:off x="0" y="0"/>
-                      <a:ext cx="5943600" cy="4172915"/>
+                      <a:ext cx="4572000" cy="3209934"/>
                     </a:xfrm>
                     <a:prstGeom prst="rect"/>
                   </pic:spPr>
@@ -3570,7 +3570,7 @@
       <w:r>
         <w:drawing>
           <wp:inline xmlns:a="http://schemas.openxmlformats.org/drawingml/2006/main" xmlns:pic="http://schemas.openxmlformats.org/drawingml/2006/picture">
-            <wp:extent cx="5943600" cy="2816430"/>
+            <wp:extent cx="4572000" cy="2166485"/>
             <wp:docPr id="8" name="Picture 8"/>
             <wp:cNvGraphicFramePr>
               <a:graphicFrameLocks noChangeAspect="1"/>
@@ -3591,7 +3591,7 @@
                   <pic:spPr>
                     <a:xfrm>
                       <a:off x="0" y="0"/>
-                      <a:ext cx="5943600" cy="2816430"/>
+                      <a:ext cx="4572000" cy="2166485"/>
                     </a:xfrm>
                     <a:prstGeom prst="rect"/>
                   </pic:spPr>

</xml_diff>

<commit_message>
Shorten Literature Review subsections A-D with concise human wording
</commit_message>
<xml_diff>
--- a/docs/solaraeus_manuscript.docx
+++ b/docs/solaraeus_manuscript.docx
@@ -1396,7 +1396,7 @@
     </w:p>
     <w:p>
       <w:r>
-        <w:t>Urban microclimate simulation has traditionally relied on coupled atmospheric and computational fluid dynamics (CFD) formulations, such as ENVI-met (Bruse and Fleer 1998) or the LES-based PALM-4U model evaluated by Eingrüber et al. (2025) across Berlin street canyons. While physically comprehensive, Navier–Stokes fluid modeling imposes heavy computational penalties, frequently consuming hours of multi-core CPU cluster time per diurnal cycle and rendering iterative architectural exploration prohibitive (Krayenhoff et al. 2021). To alleviate this overhead, decoupled radiation engines have emerged as the standard paradigm for pedestrian thermal comfort assessment. By decoupling shortwave and longwave radiative flux calculations from convective fluid motion, the Solar and Longwave Environmental Irradiance Geometry (SOLWEIG) engine (Lindberg et al. 2008, 2018) estimates human radiant exposure at sub-meter spatial resolutions in seconds. Recent investigations have extended decoupled ray tracing to direct solar shading of building envelopes (Rayegan et al. 2025), urban canyon microclimate coupling (Bourquin et al. 2025), retro-reflective pavement modeling (Yuan et al. 2025), and vegetative cooling assessments (Chen et al. 2024; Baia et al. 2026). However, existing decoupled simulation engines operate strictly on monolithic batch principles: whenever a localized intervention—such as an overhead fabric canopy or tree planter—is placed within the urban corridor, the solver discards all precomputed spatial states and recomputes the entire digital twin from scratch, ignoring spatial sparsity and bounding properties.</w:t>
+        <w:t>Urban microclimates have historically been simulated using coupled formulations like ENVI-met (Bruse and Fleer 1998) and PALM-4U (Eingrüber et al. 2025). While physically comprehensive, full Navier–Stokes fluid simulations require hours on multi-core clusters per diurnal cycle, making iterative design impractical (Krayenhoff et al. 2021). Decoupled radiation models like SOLWEIG (Lindberg et al. 2008, 2018) resolve this by computing shortwave and longwave fluxes separately from airflow, evaluating pedestrian thermal comfort in seconds. Recent studies have extended decoupled modeling to solar shading (Rayegan et al. 2025), urban canyons (Bourquin et al. 2025), retroreflective pavements (Yuan et al. 2025), and vegetative cooling (Baia et al. 2026; Chen et al. 2024). However, existing engines recompute the entire domain from scratch whenever a local intervention (such as a fabric canopy or tree) is introduced.</w:t>
       </w:r>
     </w:p>
     <w:p>
@@ -1414,7 +1414,7 @@
     </w:p>
     <w:p>
       <w:r>
-        <w:t>To accelerate high-resolution microclimatic calculations, recent literature has increasingly turned to massively parallel graphical processing unit (GPU) computing. Kamath et al. (2026) developed SOLWEIG-GPU, achieving substantial runtime reductions for city-scale digital twins by parallelizing discrete ray marching and shadow casting on CUDA architectures. Similarly, Mei et al. (2025) presented GUST1.0, a GPU-accelerated energy balance engine that expedites 3D surface temperature modeling across complex building geometries, while parallel geospatial algorithms in Earth informatics have demonstrated significant efficiency gains for multicriteria urban analysis (Nguyen et al. 2023). Beyond direct ray tracing, precomputed radiative transfer techniques have been adapted from computer graphics to thermal simulation. Freude et al. (2023, 2025) formulated precomputed radiative transport matrices to simulate dynamic longwave and shortwave exchanges and solve inverse thermal material problems at interactive frame rates. Nonetheless, precomputation approaches suffer from a fundamental architectural limitation: they assume stationary geometric boundary conditions. The introduction of even a single localized shading canopy alters the geometric horizon and view-factor relationships, invalidating the precomputed transport matrices and necessitating an expensive full-domain rebuild. Crucially, prior GPU frameworks accelerate full-domain recomputation rather than formulating incremental reuse mechanisms.</w:t>
+        <w:t>To accelerate large simulations, recent tools leverage GPU parallelism. Kamath et al. (2026) developed SOLWEIG-GPU for city-scale comfort modeling via CUDA ray marching, while Mei et al. (2025) introduced GUST1.0 for GPU-based surface energy balances, and Nguyen et al. (2023) applied parallel geospatial algorithms. In computer graphics, Freude et al. (2023, 2025) used precomputed radiative transport matrices to simulate dynamic thermal exchange in real time. However, precomputed matrices assume stationary geometry; adding even a single canopy alters the scene and invalidates the entire matrix. Existing GPU frameworks thus accelerate full recalculations rather than incrementally reusing unaffected cells.</w:t>
       </w:r>
     </w:p>
     <w:p>
@@ -1432,7 +1432,7 @@
     </w:p>
     <w:p>
       <w:r>
-        <w:t>Recognizing the computational friction of physics-based solvers, researchers have extensively explored machine learning surrogates for urban heat island mitigation and microclimatic planning (Tao et al. 2025; Do et al. 2024). Deep learning surrogate architectures, such as the localized Fourier Neural Operators developed by Qin et al. (2024), map geometric and atmospheric boundary conditions to full 3D microclimate fields in milliseconds. However, machine learning surrogates introduce two severe limitations in design workflows: first, black-box neural networks lack certified, closed-form physical error bounds, making them prone to uncertified extrapolation errors when evaluating novel intervention shapes or extreme heatwave meteorology (Tao et al. 2025); second, static surrogates trained on fixed design distributions exhibit sharp accuracy degradation in dense canyon environments where sharp shadow discontinuities dominate. While Bayesian active learning frameworks can iteratively refine surrogate fidelity by balancing exploitation and exploration, their practical deployment requires an underlying physical simulation engine capable of evaluating proposed interventions with sub-second latency and guaranteed numerical parity.</w:t>
+        <w:t>Surrogate modeling has also emerged to bypass heavy physics simulations (Do et al. 2024; Tao et al. 2025). For example, Qin et al. (2024) used localized Fourier Neural Operators to predict 3D microclimate fields in milliseconds. Yet neural surrogates lack certified physical error bounds and struggle with sharp shadow boundaries in complex canyons (Tao et al. 2025). While Bayesian active learning balances exploration and exploitation, it still requires an underlying physics engine that can evaluate candidate designs in sub-second time with verified numerical accuracy.</w:t>
       </w:r>
     </w:p>
     <w:p>
@@ -1450,7 +1450,7 @@
     </w:p>
     <w:p>
       <w:r>
-        <w:t>A review of the surveyed literature points out a key research gap related to the integration between microclimate simulation and computational urban design. While physics-based decoupled engines guarantee validated biometeorological accuracy, they cannot get rid of inefficient monolithic recomputation cycles. While transport matrices and neural models can run computations in real time, they become invalid with the changing geometry and are unable to deliver certified physical error bounds. The research gap lies in the lack of a framework that combines a mathematically certified incremental radiative transfer engine (which ensures bounding of truncation errors to below a degree of tolerance while reusing the majority of unaffected grid cells) with GPU acceleration and canopy optimization using active learning. Solaraeus bridges this research gap.</w:t>
+        <w:t>In summary, current decoupled physics engines offer validated biometeorological accuracy but suffer from monolithic recalculation overhead. Conversely, precomputed transport matrices and neural surrogates offer real-time speeds but break under geometric modifications or lack physical error guarantees. A framework that unites mathematically certified incremental radiative transfer with resident GPU acceleration and active canopy optimization has been missing. Solaraeus directly fills this gap.</w:t>
       </w:r>
     </w:p>
     <w:p>

</xml_diff>

<commit_message>
Reduce size and spacing for Table 1 and Table 2
</commit_message>
<xml_diff>
--- a/docs/solaraeus_manuscript.docx
+++ b/docs/solaraeus_manuscript.docx
@@ -168,17 +168,17 @@
             <w:tcW w:type="dxa" w:w="2340"/>
             <w:shd w:fill="EAEAEA"/>
             <w:tcMar>
-              <w:top w:w="80" w:type="dxa"/>
-              <w:bottom w:w="80" w:type="dxa"/>
-              <w:left w:w="100" w:type="dxa"/>
-              <w:right w:w="100" w:type="dxa"/>
+              <w:top w:w="60" w:type="dxa"/>
+              <w:bottom w:w="60" w:type="dxa"/>
+              <w:left w:w="70" w:type="dxa"/>
+              <w:right w:w="70" w:type="dxa"/>
             </w:tcMar>
           </w:tcPr>
           <w:p>
             <w:r>
               <w:rPr>
                 <w:b/>
-                <w:sz w:val="17"/>
+                <w:sz w:val="15"/>
               </w:rPr>
               <w:t>Author &amp; Year</w:t>
             </w:r>
@@ -189,17 +189,17 @@
             <w:tcW w:type="dxa" w:w="2340"/>
             <w:shd w:fill="EAEAEA"/>
             <w:tcMar>
-              <w:top w:w="80" w:type="dxa"/>
-              <w:bottom w:w="80" w:type="dxa"/>
-              <w:left w:w="100" w:type="dxa"/>
-              <w:right w:w="100" w:type="dxa"/>
+              <w:top w:w="60" w:type="dxa"/>
+              <w:bottom w:w="60" w:type="dxa"/>
+              <w:left w:w="70" w:type="dxa"/>
+              <w:right w:w="70" w:type="dxa"/>
             </w:tcMar>
           </w:tcPr>
           <w:p>
             <w:r>
               <w:rPr>
                 <w:b/>
-                <w:sz w:val="17"/>
+                <w:sz w:val="15"/>
               </w:rPr>
               <w:t>Journal / Venue</w:t>
             </w:r>
@@ -210,17 +210,17 @@
             <w:tcW w:type="dxa" w:w="2340"/>
             <w:shd w:fill="EAEAEA"/>
             <w:tcMar>
-              <w:top w:w="80" w:type="dxa"/>
-              <w:bottom w:w="80" w:type="dxa"/>
-              <w:left w:w="100" w:type="dxa"/>
-              <w:right w:w="100" w:type="dxa"/>
+              <w:top w:w="60" w:type="dxa"/>
+              <w:bottom w:w="60" w:type="dxa"/>
+              <w:left w:w="70" w:type="dxa"/>
+              <w:right w:w="70" w:type="dxa"/>
             </w:tcMar>
           </w:tcPr>
           <w:p>
             <w:r>
               <w:rPr>
                 <w:b/>
-                <w:sz w:val="17"/>
+                <w:sz w:val="15"/>
               </w:rPr>
               <w:t>Core Contribution</w:t>
             </w:r>
@@ -231,17 +231,17 @@
             <w:tcW w:type="dxa" w:w="2340"/>
             <w:shd w:fill="EAEAEA"/>
             <w:tcMar>
-              <w:top w:w="80" w:type="dxa"/>
-              <w:bottom w:w="80" w:type="dxa"/>
-              <w:left w:w="100" w:type="dxa"/>
-              <w:right w:w="100" w:type="dxa"/>
+              <w:top w:w="60" w:type="dxa"/>
+              <w:bottom w:w="60" w:type="dxa"/>
+              <w:left w:w="70" w:type="dxa"/>
+              <w:right w:w="70" w:type="dxa"/>
             </w:tcMar>
           </w:tcPr>
           <w:p>
             <w:r>
               <w:rPr>
                 <w:b/>
-                <w:sz w:val="17"/>
+                <w:sz w:val="15"/>
               </w:rPr>
               <w:t>Identified Limitation</w:t>
             </w:r>
@@ -253,16 +253,16 @@
           <w:tcPr>
             <w:tcW w:type="dxa" w:w="2340"/>
             <w:tcMar>
-              <w:top w:w="60" w:type="dxa"/>
-              <w:bottom w:w="60" w:type="dxa"/>
-              <w:left w:w="90" w:type="dxa"/>
-              <w:right w:w="90" w:type="dxa"/>
+              <w:top w:w="40" w:type="dxa"/>
+              <w:bottom w:w="40" w:type="dxa"/>
+              <w:left w:w="60" w:type="dxa"/>
+              <w:right w:w="60" w:type="dxa"/>
             </w:tcMar>
           </w:tcPr>
           <w:p>
             <w:r>
               <w:rPr>
-                <w:sz w:val="16"/>
+                <w:sz w:val="14"/>
               </w:rPr>
               <w:t>Baia et al. (2026)</w:t>
             </w:r>
@@ -272,16 +272,16 @@
           <w:tcPr>
             <w:tcW w:type="dxa" w:w="2340"/>
             <w:tcMar>
-              <w:top w:w="60" w:type="dxa"/>
-              <w:bottom w:w="60" w:type="dxa"/>
-              <w:left w:w="90" w:type="dxa"/>
-              <w:right w:w="90" w:type="dxa"/>
+              <w:top w:w="40" w:type="dxa"/>
+              <w:bottom w:w="40" w:type="dxa"/>
+              <w:left w:w="60" w:type="dxa"/>
+              <w:right w:w="60" w:type="dxa"/>
             </w:tcMar>
           </w:tcPr>
           <w:p>
             <w:r>
               <w:rPr>
-                <w:sz w:val="16"/>
+                <w:sz w:val="14"/>
               </w:rPr>
               <w:t>Computational Urban Science</w:t>
             </w:r>
@@ -291,16 +291,16 @@
           <w:tcPr>
             <w:tcW w:type="dxa" w:w="2340"/>
             <w:tcMar>
-              <w:top w:w="60" w:type="dxa"/>
-              <w:bottom w:w="60" w:type="dxa"/>
-              <w:left w:w="90" w:type="dxa"/>
-              <w:right w:w="90" w:type="dxa"/>
+              <w:top w:w="40" w:type="dxa"/>
+              <w:bottom w:w="40" w:type="dxa"/>
+              <w:left w:w="60" w:type="dxa"/>
+              <w:right w:w="60" w:type="dxa"/>
             </w:tcMar>
           </w:tcPr>
           <w:p>
             <w:r>
               <w:rPr>
-                <w:sz w:val="16"/>
+                <w:sz w:val="14"/>
               </w:rPr>
               <w:t>Clustering high-resolution microclimatic features to identify spatial heat island morphologies.</w:t>
             </w:r>
@@ -310,16 +310,16 @@
           <w:tcPr>
             <w:tcW w:type="dxa" w:w="2340"/>
             <w:tcMar>
-              <w:top w:w="60" w:type="dxa"/>
-              <w:bottom w:w="60" w:type="dxa"/>
-              <w:left w:w="90" w:type="dxa"/>
-              <w:right w:w="90" w:type="dxa"/>
+              <w:top w:w="40" w:type="dxa"/>
+              <w:bottom w:w="40" w:type="dxa"/>
+              <w:left w:w="60" w:type="dxa"/>
+              <w:right w:w="60" w:type="dxa"/>
             </w:tcMar>
           </w:tcPr>
           <w:p>
             <w:r>
               <w:rPr>
-                <w:sz w:val="16"/>
+                <w:sz w:val="14"/>
               </w:rPr>
               <w:t>Identified thermal morphology clusters but lacked real-time 3D ray-traced geometric shading.</w:t>
             </w:r>
@@ -331,17 +331,17 @@
           <w:tcPr>
             <w:tcW w:type="dxa" w:w="2340"/>
             <w:tcMar>
-              <w:top w:w="60" w:type="dxa"/>
-              <w:bottom w:w="60" w:type="dxa"/>
-              <w:left w:w="90" w:type="dxa"/>
-              <w:right w:w="90" w:type="dxa"/>
+              <w:top w:w="40" w:type="dxa"/>
+              <w:bottom w:w="40" w:type="dxa"/>
+              <w:left w:w="60" w:type="dxa"/>
+              <w:right w:w="60" w:type="dxa"/>
             </w:tcMar>
             <w:shd w:fill="FAFAFA"/>
           </w:tcPr>
           <w:p>
             <w:r>
               <w:rPr>
-                <w:sz w:val="16"/>
+                <w:sz w:val="14"/>
               </w:rPr>
               <w:t>Kamath et al. (2026)</w:t>
             </w:r>
@@ -351,17 +351,17 @@
           <w:tcPr>
             <w:tcW w:type="dxa" w:w="2340"/>
             <w:tcMar>
-              <w:top w:w="60" w:type="dxa"/>
-              <w:bottom w:w="60" w:type="dxa"/>
-              <w:left w:w="90" w:type="dxa"/>
-              <w:right w:w="90" w:type="dxa"/>
+              <w:top w:w="40" w:type="dxa"/>
+              <w:bottom w:w="40" w:type="dxa"/>
+              <w:left w:w="60" w:type="dxa"/>
+              <w:right w:w="60" w:type="dxa"/>
             </w:tcMar>
             <w:shd w:fill="FAFAFA"/>
           </w:tcPr>
           <w:p>
             <w:r>
               <w:rPr>
-                <w:sz w:val="16"/>
+                <w:sz w:val="14"/>
               </w:rPr>
               <w:t>Preprint / UT Austin &amp; Gothenburg</w:t>
             </w:r>
@@ -371,17 +371,17 @@
           <w:tcPr>
             <w:tcW w:type="dxa" w:w="2340"/>
             <w:tcMar>
-              <w:top w:w="60" w:type="dxa"/>
-              <w:bottom w:w="60" w:type="dxa"/>
-              <w:left w:w="90" w:type="dxa"/>
-              <w:right w:w="90" w:type="dxa"/>
+              <w:top w:w="40" w:type="dxa"/>
+              <w:bottom w:w="40" w:type="dxa"/>
+              <w:left w:w="60" w:type="dxa"/>
+              <w:right w:w="60" w:type="dxa"/>
             </w:tcMar>
             <w:shd w:fill="FAFAFA"/>
           </w:tcPr>
           <w:p>
             <w:r>
               <w:rPr>
-                <w:sz w:val="16"/>
+                <w:sz w:val="14"/>
               </w:rPr>
               <w:t>Implemented CUDA GPU acceleration for the SOLWEIG human comfort model on digital twins.</w:t>
             </w:r>
@@ -391,17 +391,17 @@
           <w:tcPr>
             <w:tcW w:type="dxa" w:w="2340"/>
             <w:tcMar>
-              <w:top w:w="60" w:type="dxa"/>
-              <w:bottom w:w="60" w:type="dxa"/>
-              <w:left w:w="90" w:type="dxa"/>
-              <w:right w:w="90" w:type="dxa"/>
+              <w:top w:w="40" w:type="dxa"/>
+              <w:bottom w:w="40" w:type="dxa"/>
+              <w:left w:w="60" w:type="dxa"/>
+              <w:right w:w="60" w:type="dxa"/>
             </w:tcMar>
             <w:shd w:fill="FAFAFA"/>
           </w:tcPr>
           <w:p>
             <w:r>
               <w:rPr>
-                <w:sz w:val="16"/>
+                <w:sz w:val="14"/>
               </w:rPr>
               <w:t>Accelerated full-domain batch recalculations but did not formulate incremental cell reuse.</w:t>
             </w:r>
@@ -413,16 +413,16 @@
           <w:tcPr>
             <w:tcW w:type="dxa" w:w="2340"/>
             <w:tcMar>
-              <w:top w:w="60" w:type="dxa"/>
-              <w:bottom w:w="60" w:type="dxa"/>
-              <w:left w:w="90" w:type="dxa"/>
-              <w:right w:w="90" w:type="dxa"/>
+              <w:top w:w="40" w:type="dxa"/>
+              <w:bottom w:w="40" w:type="dxa"/>
+              <w:left w:w="60" w:type="dxa"/>
+              <w:right w:w="60" w:type="dxa"/>
             </w:tcMar>
           </w:tcPr>
           <w:p>
             <w:r>
               <w:rPr>
-                <w:sz w:val="16"/>
+                <w:sz w:val="14"/>
               </w:rPr>
               <w:t>Eingrüber et al. (2025)</w:t>
             </w:r>
@@ -432,16 +432,16 @@
           <w:tcPr>
             <w:tcW w:type="dxa" w:w="2340"/>
             <w:tcMar>
-              <w:top w:w="60" w:type="dxa"/>
-              <w:bottom w:w="60" w:type="dxa"/>
-              <w:left w:w="90" w:type="dxa"/>
-              <w:right w:w="90" w:type="dxa"/>
+              <w:top w:w="40" w:type="dxa"/>
+              <w:bottom w:w="40" w:type="dxa"/>
+              <w:left w:w="60" w:type="dxa"/>
+              <w:right w:w="60" w:type="dxa"/>
             </w:tcMar>
           </w:tcPr>
           <w:p>
             <w:r>
               <w:rPr>
-                <w:sz w:val="16"/>
+                <w:sz w:val="14"/>
               </w:rPr>
               <w:t>Geoscientific Model Development</w:t>
             </w:r>
@@ -451,16 +451,16 @@
           <w:tcPr>
             <w:tcW w:type="dxa" w:w="2340"/>
             <w:tcMar>
-              <w:top w:w="60" w:type="dxa"/>
-              <w:bottom w:w="60" w:type="dxa"/>
-              <w:left w:w="90" w:type="dxa"/>
-              <w:right w:w="90" w:type="dxa"/>
+              <w:top w:w="40" w:type="dxa"/>
+              <w:bottom w:w="40" w:type="dxa"/>
+              <w:left w:w="60" w:type="dxa"/>
+              <w:right w:w="60" w:type="dxa"/>
             </w:tcMar>
           </w:tcPr>
           <w:p>
             <w:r>
               <w:rPr>
-                <w:sz w:val="16"/>
+                <w:sz w:val="14"/>
               </w:rPr>
               <w:t>Simulated urban greening cooling in Berlin canyons using PALM-4U across grid resolutions.</w:t>
             </w:r>
@@ -470,16 +470,16 @@
           <w:tcPr>
             <w:tcW w:type="dxa" w:w="2340"/>
             <w:tcMar>
-              <w:top w:w="60" w:type="dxa"/>
-              <w:bottom w:w="60" w:type="dxa"/>
-              <w:left w:w="90" w:type="dxa"/>
-              <w:right w:w="90" w:type="dxa"/>
+              <w:top w:w="40" w:type="dxa"/>
+              <w:bottom w:w="40" w:type="dxa"/>
+              <w:left w:w="60" w:type="dxa"/>
+              <w:right w:w="60" w:type="dxa"/>
             </w:tcMar>
           </w:tcPr>
           <w:p>
             <w:r>
               <w:rPr>
-                <w:sz w:val="16"/>
+                <w:sz w:val="14"/>
               </w:rPr>
               <w:t>High physical realism but required heavy multi-core CPU compute times of several hours.</w:t>
             </w:r>
@@ -491,17 +491,17 @@
           <w:tcPr>
             <w:tcW w:type="dxa" w:w="2340"/>
             <w:tcMar>
-              <w:top w:w="60" w:type="dxa"/>
-              <w:bottom w:w="60" w:type="dxa"/>
-              <w:left w:w="90" w:type="dxa"/>
-              <w:right w:w="90" w:type="dxa"/>
+              <w:top w:w="40" w:type="dxa"/>
+              <w:bottom w:w="40" w:type="dxa"/>
+              <w:left w:w="60" w:type="dxa"/>
+              <w:right w:w="60" w:type="dxa"/>
             </w:tcMar>
             <w:shd w:fill="FAFAFA"/>
           </w:tcPr>
           <w:p>
             <w:r>
               <w:rPr>
-                <w:sz w:val="16"/>
+                <w:sz w:val="14"/>
               </w:rPr>
               <w:t>Mei et al. (2025)</w:t>
             </w:r>
@@ -511,17 +511,17 @@
           <w:tcPr>
             <w:tcW w:type="dxa" w:w="2340"/>
             <w:tcMar>
-              <w:top w:w="60" w:type="dxa"/>
-              <w:bottom w:w="60" w:type="dxa"/>
-              <w:left w:w="90" w:type="dxa"/>
-              <w:right w:w="90" w:type="dxa"/>
+              <w:top w:w="40" w:type="dxa"/>
+              <w:bottom w:w="40" w:type="dxa"/>
+              <w:left w:w="60" w:type="dxa"/>
+              <w:right w:w="60" w:type="dxa"/>
             </w:tcMar>
             <w:shd w:fill="FAFAFA"/>
           </w:tcPr>
           <w:p>
             <w:r>
               <w:rPr>
-                <w:sz w:val="16"/>
+                <w:sz w:val="14"/>
               </w:rPr>
               <w:t>Geoscientific Model Development</w:t>
             </w:r>
@@ -531,17 +531,17 @@
           <w:tcPr>
             <w:tcW w:type="dxa" w:w="2340"/>
             <w:tcMar>
-              <w:top w:w="60" w:type="dxa"/>
-              <w:bottom w:w="60" w:type="dxa"/>
-              <w:left w:w="90" w:type="dxa"/>
-              <w:right w:w="90" w:type="dxa"/>
+              <w:top w:w="40" w:type="dxa"/>
+              <w:bottom w:w="40" w:type="dxa"/>
+              <w:left w:w="60" w:type="dxa"/>
+              <w:right w:w="60" w:type="dxa"/>
             </w:tcMar>
             <w:shd w:fill="FAFAFA"/>
           </w:tcPr>
           <w:p>
             <w:r>
               <w:rPr>
-                <w:sz w:val="16"/>
+                <w:sz w:val="14"/>
               </w:rPr>
               <w:t>Developed GUST1.0 GPU-accelerated 3D urban surface temperature and energy balance engine.</w:t>
             </w:r>
@@ -551,17 +551,17 @@
           <w:tcPr>
             <w:tcW w:type="dxa" w:w="2340"/>
             <w:tcMar>
-              <w:top w:w="60" w:type="dxa"/>
-              <w:bottom w:w="60" w:type="dxa"/>
-              <w:left w:w="90" w:type="dxa"/>
-              <w:right w:w="90" w:type="dxa"/>
+              <w:top w:w="40" w:type="dxa"/>
+              <w:bottom w:w="40" w:type="dxa"/>
+              <w:left w:w="60" w:type="dxa"/>
+              <w:right w:w="60" w:type="dxa"/>
             </w:tcMar>
             <w:shd w:fill="FAFAFA"/>
           </w:tcPr>
           <w:p>
             <w:r>
               <w:rPr>
-                <w:sz w:val="16"/>
+                <w:sz w:val="14"/>
               </w:rPr>
               <w:t>Significantly reduced surface temperature solve time; focused on building facades rather than pedestrian grids.</w:t>
             </w:r>
@@ -573,16 +573,16 @@
           <w:tcPr>
             <w:tcW w:type="dxa" w:w="2340"/>
             <w:tcMar>
-              <w:top w:w="60" w:type="dxa"/>
-              <w:bottom w:w="60" w:type="dxa"/>
-              <w:left w:w="90" w:type="dxa"/>
-              <w:right w:w="90" w:type="dxa"/>
+              <w:top w:w="40" w:type="dxa"/>
+              <w:bottom w:w="40" w:type="dxa"/>
+              <w:left w:w="60" w:type="dxa"/>
+              <w:right w:w="60" w:type="dxa"/>
             </w:tcMar>
           </w:tcPr>
           <w:p>
             <w:r>
               <w:rPr>
-                <w:sz w:val="16"/>
+                <w:sz w:val="14"/>
               </w:rPr>
               <w:t>Freude et al. (2025)</w:t>
             </w:r>
@@ -592,16 +592,16 @@
           <w:tcPr>
             <w:tcW w:type="dxa" w:w="2340"/>
             <w:tcMar>
-              <w:top w:w="60" w:type="dxa"/>
-              <w:bottom w:w="60" w:type="dxa"/>
-              <w:left w:w="90" w:type="dxa"/>
-              <w:right w:w="90" w:type="dxa"/>
+              <w:top w:w="40" w:type="dxa"/>
+              <w:bottom w:w="40" w:type="dxa"/>
+              <w:left w:w="60" w:type="dxa"/>
+              <w:right w:w="60" w:type="dxa"/>
             </w:tcMar>
           </w:tcPr>
           <w:p>
             <w:r>
               <w:rPr>
-                <w:sz w:val="16"/>
+                <w:sz w:val="14"/>
               </w:rPr>
               <w:t>Computer Graphics Forum</w:t>
             </w:r>
@@ -611,16 +611,16 @@
           <w:tcPr>
             <w:tcW w:type="dxa" w:w="2340"/>
             <w:tcMar>
-              <w:top w:w="60" w:type="dxa"/>
-              <w:bottom w:w="60" w:type="dxa"/>
-              <w:left w:w="90" w:type="dxa"/>
-              <w:right w:w="90" w:type="dxa"/>
+              <w:top w:w="40" w:type="dxa"/>
+              <w:bottom w:w="40" w:type="dxa"/>
+              <w:left w:w="60" w:type="dxa"/>
+              <w:right w:w="60" w:type="dxa"/>
             </w:tcMar>
           </w:tcPr>
           <w:p>
             <w:r>
               <w:rPr>
-                <w:sz w:val="16"/>
+                <w:sz w:val="14"/>
               </w:rPr>
               <w:t>Formulated inverse radiative thermal simulation using precomputed light transport matrices.</w:t>
             </w:r>
@@ -630,16 +630,16 @@
           <w:tcPr>
             <w:tcW w:type="dxa" w:w="2340"/>
             <w:tcMar>
-              <w:top w:w="60" w:type="dxa"/>
-              <w:bottom w:w="60" w:type="dxa"/>
-              <w:left w:w="90" w:type="dxa"/>
-              <w:right w:w="90" w:type="dxa"/>
+              <w:top w:w="40" w:type="dxa"/>
+              <w:bottom w:w="40" w:type="dxa"/>
+              <w:left w:w="60" w:type="dxa"/>
+              <w:right w:w="60" w:type="dxa"/>
             </w:tcMar>
           </w:tcPr>
           <w:p>
             <w:r>
               <w:rPr>
-                <w:sz w:val="16"/>
+                <w:sz w:val="14"/>
               </w:rPr>
               <w:t>Optimized surface thermal material placement; did not address real-time pedestrian comfort metrics.</w:t>
             </w:r>
@@ -651,17 +651,17 @@
           <w:tcPr>
             <w:tcW w:type="dxa" w:w="2340"/>
             <w:tcMar>
-              <w:top w:w="60" w:type="dxa"/>
-              <w:bottom w:w="60" w:type="dxa"/>
-              <w:left w:w="90" w:type="dxa"/>
-              <w:right w:w="90" w:type="dxa"/>
+              <w:top w:w="40" w:type="dxa"/>
+              <w:bottom w:w="40" w:type="dxa"/>
+              <w:left w:w="60" w:type="dxa"/>
+              <w:right w:w="60" w:type="dxa"/>
             </w:tcMar>
             <w:shd w:fill="FAFAFA"/>
           </w:tcPr>
           <w:p>
             <w:r>
               <w:rPr>
-                <w:sz w:val="16"/>
+                <w:sz w:val="14"/>
               </w:rPr>
               <w:t>Bourquin et al. (2025)</w:t>
             </w:r>
@@ -671,17 +671,17 @@
           <w:tcPr>
             <w:tcW w:type="dxa" w:w="2340"/>
             <w:tcMar>
-              <w:top w:w="60" w:type="dxa"/>
-              <w:bottom w:w="60" w:type="dxa"/>
-              <w:left w:w="90" w:type="dxa"/>
-              <w:right w:w="90" w:type="dxa"/>
+              <w:top w:w="40" w:type="dxa"/>
+              <w:bottom w:w="40" w:type="dxa"/>
+              <w:left w:w="60" w:type="dxa"/>
+              <w:right w:w="60" w:type="dxa"/>
             </w:tcMar>
             <w:shd w:fill="FAFAFA"/>
           </w:tcPr>
           <w:p>
             <w:r>
               <w:rPr>
-                <w:sz w:val="16"/>
+                <w:sz w:val="14"/>
               </w:rPr>
               <w:t>IBPSA Proceedings</w:t>
             </w:r>
@@ -691,17 +691,17 @@
           <w:tcPr>
             <w:tcW w:type="dxa" w:w="2340"/>
             <w:tcMar>
-              <w:top w:w="60" w:type="dxa"/>
-              <w:bottom w:w="60" w:type="dxa"/>
-              <w:left w:w="90" w:type="dxa"/>
-              <w:right w:w="90" w:type="dxa"/>
+              <w:top w:w="40" w:type="dxa"/>
+              <w:bottom w:w="40" w:type="dxa"/>
+              <w:left w:w="60" w:type="dxa"/>
+              <w:right w:w="60" w:type="dxa"/>
             </w:tcMar>
             <w:shd w:fill="FAFAFA"/>
           </w:tcPr>
           <w:p>
             <w:r>
               <w:rPr>
-                <w:sz w:val="16"/>
+                <w:sz w:val="14"/>
               </w:rPr>
               <w:t>Coupled mesoscale boundary forcings with microscale street canyon geometry for energy modeling.</w:t>
             </w:r>
@@ -711,17 +711,17 @@
           <w:tcPr>
             <w:tcW w:type="dxa" w:w="2340"/>
             <w:tcMar>
-              <w:top w:w="60" w:type="dxa"/>
-              <w:bottom w:w="60" w:type="dxa"/>
-              <w:left w:w="90" w:type="dxa"/>
-              <w:right w:w="90" w:type="dxa"/>
+              <w:top w:w="40" w:type="dxa"/>
+              <w:bottom w:w="40" w:type="dxa"/>
+              <w:left w:w="60" w:type="dxa"/>
+              <w:right w:w="60" w:type="dxa"/>
             </w:tcMar>
             <w:shd w:fill="FAFAFA"/>
           </w:tcPr>
           <w:p>
             <w:r>
               <w:rPr>
-                <w:sz w:val="16"/>
+                <w:sz w:val="14"/>
               </w:rPr>
               <w:t>Refined street-level boundary temperatures; lacked automated canopy placement optimization.</w:t>
             </w:r>
@@ -733,16 +733,16 @@
           <w:tcPr>
             <w:tcW w:type="dxa" w:w="2340"/>
             <w:tcMar>
-              <w:top w:w="60" w:type="dxa"/>
-              <w:bottom w:w="60" w:type="dxa"/>
-              <w:left w:w="90" w:type="dxa"/>
-              <w:right w:w="90" w:type="dxa"/>
+              <w:top w:w="40" w:type="dxa"/>
+              <w:bottom w:w="40" w:type="dxa"/>
+              <w:left w:w="60" w:type="dxa"/>
+              <w:right w:w="60" w:type="dxa"/>
             </w:tcMar>
           </w:tcPr>
           <w:p>
             <w:r>
               <w:rPr>
-                <w:sz w:val="16"/>
+                <w:sz w:val="14"/>
               </w:rPr>
               <w:t>Rayegan et al. (2025)</w:t>
             </w:r>
@@ -752,16 +752,16 @@
           <w:tcPr>
             <w:tcW w:type="dxa" w:w="2340"/>
             <w:tcMar>
-              <w:top w:w="60" w:type="dxa"/>
-              <w:bottom w:w="60" w:type="dxa"/>
-              <w:left w:w="90" w:type="dxa"/>
-              <w:right w:w="90" w:type="dxa"/>
+              <w:top w:w="40" w:type="dxa"/>
+              <w:bottom w:w="40" w:type="dxa"/>
+              <w:left w:w="60" w:type="dxa"/>
+              <w:right w:w="60" w:type="dxa"/>
             </w:tcMar>
           </w:tcPr>
           <w:p>
             <w:r>
               <w:rPr>
-                <w:sz w:val="16"/>
+                <w:sz w:val="14"/>
               </w:rPr>
               <w:t>Building and Environment</w:t>
             </w:r>
@@ -771,16 +771,16 @@
           <w:tcPr>
             <w:tcW w:type="dxa" w:w="2340"/>
             <w:tcMar>
-              <w:top w:w="60" w:type="dxa"/>
-              <w:bottom w:w="60" w:type="dxa"/>
-              <w:left w:w="90" w:type="dxa"/>
-              <w:right w:w="90" w:type="dxa"/>
+              <w:top w:w="40" w:type="dxa"/>
+              <w:bottom w:w="40" w:type="dxa"/>
+              <w:left w:w="60" w:type="dxa"/>
+              <w:right w:w="60" w:type="dxa"/>
             </w:tcMar>
           </w:tcPr>
           <w:p>
             <w:r>
               <w:rPr>
-                <w:sz w:val="16"/>
+                <w:sz w:val="14"/>
               </w:rPr>
               <w:t>Developed 3D ray tracing-based direct solar shading model for building envelopes.</w:t>
             </w:r>
@@ -790,16 +790,16 @@
           <w:tcPr>
             <w:tcW w:type="dxa" w:w="2340"/>
             <w:tcMar>
-              <w:top w:w="60" w:type="dxa"/>
-              <w:bottom w:w="60" w:type="dxa"/>
-              <w:left w:w="90" w:type="dxa"/>
-              <w:right w:w="90" w:type="dxa"/>
+              <w:top w:w="40" w:type="dxa"/>
+              <w:bottom w:w="40" w:type="dxa"/>
+              <w:left w:w="60" w:type="dxa"/>
+              <w:right w:w="60" w:type="dxa"/>
             </w:tcMar>
           </w:tcPr>
           <w:p>
             <w:r>
               <w:rPr>
-                <w:sz w:val="16"/>
+                <w:sz w:val="14"/>
               </w:rPr>
               <w:t>Accurately resolved complex building shadows; evaluated static annual steps without active learning.</w:t>
             </w:r>
@@ -811,17 +811,17 @@
           <w:tcPr>
             <w:tcW w:type="dxa" w:w="2340"/>
             <w:tcMar>
-              <w:top w:w="60" w:type="dxa"/>
-              <w:bottom w:w="60" w:type="dxa"/>
-              <w:left w:w="90" w:type="dxa"/>
-              <w:right w:w="90" w:type="dxa"/>
+              <w:top w:w="40" w:type="dxa"/>
+              <w:bottom w:w="40" w:type="dxa"/>
+              <w:left w:w="60" w:type="dxa"/>
+              <w:right w:w="60" w:type="dxa"/>
             </w:tcMar>
             <w:shd w:fill="FAFAFA"/>
           </w:tcPr>
           <w:p>
             <w:r>
               <w:rPr>
-                <w:sz w:val="16"/>
+                <w:sz w:val="14"/>
               </w:rPr>
               <w:t>Tao et al. (2025)</w:t>
             </w:r>
@@ -831,17 +831,17 @@
           <w:tcPr>
             <w:tcW w:type="dxa" w:w="2340"/>
             <w:tcMar>
-              <w:top w:w="60" w:type="dxa"/>
-              <w:bottom w:w="60" w:type="dxa"/>
-              <w:left w:w="90" w:type="dxa"/>
-              <w:right w:w="90" w:type="dxa"/>
+              <w:top w:w="40" w:type="dxa"/>
+              <w:bottom w:w="40" w:type="dxa"/>
+              <w:left w:w="60" w:type="dxa"/>
+              <w:right w:w="60" w:type="dxa"/>
             </w:tcMar>
             <w:shd w:fill="FAFAFA"/>
           </w:tcPr>
           <w:p>
             <w:r>
               <w:rPr>
-                <w:sz w:val="16"/>
+                <w:sz w:val="14"/>
               </w:rPr>
               <w:t>Renewable and Sustainable Energy Reviews</w:t>
             </w:r>
@@ -851,17 +851,17 @@
           <w:tcPr>
             <w:tcW w:type="dxa" w:w="2340"/>
             <w:tcMar>
-              <w:top w:w="60" w:type="dxa"/>
-              <w:bottom w:w="60" w:type="dxa"/>
-              <w:left w:w="90" w:type="dxa"/>
-              <w:right w:w="90" w:type="dxa"/>
+              <w:top w:w="40" w:type="dxa"/>
+              <w:bottom w:w="40" w:type="dxa"/>
+              <w:left w:w="60" w:type="dxa"/>
+              <w:right w:w="60" w:type="dxa"/>
             </w:tcMar>
             <w:shd w:fill="FAFAFA"/>
           </w:tcPr>
           <w:p>
             <w:r>
               <w:rPr>
-                <w:sz w:val="16"/>
+                <w:sz w:val="14"/>
               </w:rPr>
               <w:t>Systematically reviewed CFD and machine learning integration for urban green infrastructure.</w:t>
             </w:r>
@@ -871,17 +871,17 @@
           <w:tcPr>
             <w:tcW w:type="dxa" w:w="2340"/>
             <w:tcMar>
-              <w:top w:w="60" w:type="dxa"/>
-              <w:bottom w:w="60" w:type="dxa"/>
-              <w:left w:w="90" w:type="dxa"/>
-              <w:right w:w="90" w:type="dxa"/>
+              <w:top w:w="40" w:type="dxa"/>
+              <w:bottom w:w="40" w:type="dxa"/>
+              <w:left w:w="60" w:type="dxa"/>
+              <w:right w:w="60" w:type="dxa"/>
             </w:tcMar>
             <w:shd w:fill="FAFAFA"/>
           </w:tcPr>
           <w:p>
             <w:r>
               <w:rPr>
-                <w:sz w:val="16"/>
+                <w:sz w:val="14"/>
               </w:rPr>
               <w:t>Highlighted high surrogate speedup; noted severe surrogate degradation outside training envelopes.</w:t>
             </w:r>
@@ -893,16 +893,16 @@
           <w:tcPr>
             <w:tcW w:type="dxa" w:w="2340"/>
             <w:tcMar>
-              <w:top w:w="60" w:type="dxa"/>
-              <w:bottom w:w="60" w:type="dxa"/>
-              <w:left w:w="90" w:type="dxa"/>
-              <w:right w:w="90" w:type="dxa"/>
+              <w:top w:w="40" w:type="dxa"/>
+              <w:bottom w:w="40" w:type="dxa"/>
+              <w:left w:w="60" w:type="dxa"/>
+              <w:right w:w="60" w:type="dxa"/>
             </w:tcMar>
           </w:tcPr>
           <w:p>
             <w:r>
               <w:rPr>
-                <w:sz w:val="16"/>
+                <w:sz w:val="14"/>
               </w:rPr>
               <w:t>Yuan et al. (2025)</w:t>
             </w:r>
@@ -912,16 +912,16 @@
           <w:tcPr>
             <w:tcW w:type="dxa" w:w="2340"/>
             <w:tcMar>
-              <w:top w:w="60" w:type="dxa"/>
-              <w:bottom w:w="60" w:type="dxa"/>
-              <w:left w:w="90" w:type="dxa"/>
-              <w:right w:w="90" w:type="dxa"/>
+              <w:top w:w="40" w:type="dxa"/>
+              <w:bottom w:w="40" w:type="dxa"/>
+              <w:left w:w="60" w:type="dxa"/>
+              <w:right w:w="60" w:type="dxa"/>
             </w:tcMar>
           </w:tcPr>
           <w:p>
             <w:r>
               <w:rPr>
-                <w:sz w:val="16"/>
+                <w:sz w:val="14"/>
               </w:rPr>
               <w:t>Discover Cities</w:t>
             </w:r>
@@ -931,16 +931,16 @@
           <w:tcPr>
             <w:tcW w:type="dxa" w:w="2340"/>
             <w:tcMar>
-              <w:top w:w="60" w:type="dxa"/>
-              <w:bottom w:w="60" w:type="dxa"/>
-              <w:left w:w="90" w:type="dxa"/>
-              <w:right w:w="90" w:type="dxa"/>
+              <w:top w:w="40" w:type="dxa"/>
+              <w:bottom w:w="40" w:type="dxa"/>
+              <w:left w:w="60" w:type="dxa"/>
+              <w:right w:w="60" w:type="dxa"/>
             </w:tcMar>
           </w:tcPr>
           <w:p>
             <w:r>
               <w:rPr>
-                <w:sz w:val="16"/>
+                <w:sz w:val="14"/>
               </w:rPr>
               <w:t>Simulated retro-reflective pavement materials to mitigate canyon radiant heat trapping.</w:t>
             </w:r>
@@ -950,16 +950,16 @@
           <w:tcPr>
             <w:tcW w:type="dxa" w:w="2340"/>
             <w:tcMar>
-              <w:top w:w="60" w:type="dxa"/>
-              <w:bottom w:w="60" w:type="dxa"/>
-              <w:left w:w="90" w:type="dxa"/>
-              <w:right w:w="90" w:type="dxa"/>
+              <w:top w:w="40" w:type="dxa"/>
+              <w:bottom w:w="40" w:type="dxa"/>
+              <w:left w:w="60" w:type="dxa"/>
+              <w:right w:w="60" w:type="dxa"/>
             </w:tcMar>
           </w:tcPr>
           <w:p>
             <w:r>
               <w:rPr>
-                <w:sz w:val="16"/>
+                <w:sz w:val="14"/>
               </w:rPr>
               <w:t>Demonstrated shortwave trapping reduction; evaluated uniform materials rather than localized canopies.</w:t>
             </w:r>
@@ -971,17 +971,17 @@
           <w:tcPr>
             <w:tcW w:type="dxa" w:w="2340"/>
             <w:tcMar>
-              <w:top w:w="60" w:type="dxa"/>
-              <w:bottom w:w="60" w:type="dxa"/>
-              <w:left w:w="90" w:type="dxa"/>
-              <w:right w:w="90" w:type="dxa"/>
+              <w:top w:w="40" w:type="dxa"/>
+              <w:bottom w:w="40" w:type="dxa"/>
+              <w:left w:w="60" w:type="dxa"/>
+              <w:right w:w="60" w:type="dxa"/>
             </w:tcMar>
             <w:shd w:fill="FAFAFA"/>
           </w:tcPr>
           <w:p>
             <w:r>
               <w:rPr>
-                <w:sz w:val="16"/>
+                <w:sz w:val="14"/>
               </w:rPr>
               <w:t>Do et al. (2024)</w:t>
             </w:r>
@@ -991,17 +991,17 @@
           <w:tcPr>
             <w:tcW w:type="dxa" w:w="2340"/>
             <w:tcMar>
-              <w:top w:w="60" w:type="dxa"/>
-              <w:bottom w:w="60" w:type="dxa"/>
-              <w:left w:w="90" w:type="dxa"/>
-              <w:right w:w="90" w:type="dxa"/>
+              <w:top w:w="40" w:type="dxa"/>
+              <w:bottom w:w="40" w:type="dxa"/>
+              <w:left w:w="60" w:type="dxa"/>
+              <w:right w:w="60" w:type="dxa"/>
             </w:tcMar>
             <w:shd w:fill="FAFAFA"/>
           </w:tcPr>
           <w:p>
             <w:r>
               <w:rPr>
-                <w:sz w:val="16"/>
+                <w:sz w:val="14"/>
               </w:rPr>
               <w:t>Earth Science Informatics</w:t>
             </w:r>
@@ -1011,17 +1011,17 @@
           <w:tcPr>
             <w:tcW w:type="dxa" w:w="2340"/>
             <w:tcMar>
-              <w:top w:w="60" w:type="dxa"/>
-              <w:bottom w:w="60" w:type="dxa"/>
-              <w:left w:w="90" w:type="dxa"/>
-              <w:right w:w="90" w:type="dxa"/>
+              <w:top w:w="40" w:type="dxa"/>
+              <w:bottom w:w="40" w:type="dxa"/>
+              <w:left w:w="60" w:type="dxa"/>
+              <w:right w:w="60" w:type="dxa"/>
             </w:tcMar>
             <w:shd w:fill="FAFAFA"/>
           </w:tcPr>
           <w:p>
             <w:r>
               <w:rPr>
-                <w:sz w:val="16"/>
+                <w:sz w:val="14"/>
               </w:rPr>
               <w:t>Mapped urban heat dynamics using interpretable machine learning and remote sensing.</w:t>
             </w:r>
@@ -1031,17 +1031,17 @@
           <w:tcPr>
             <w:tcW w:type="dxa" w:w="2340"/>
             <w:tcMar>
-              <w:top w:w="60" w:type="dxa"/>
-              <w:bottom w:w="60" w:type="dxa"/>
-              <w:left w:w="90" w:type="dxa"/>
-              <w:right w:w="90" w:type="dxa"/>
+              <w:top w:w="40" w:type="dxa"/>
+              <w:bottom w:w="40" w:type="dxa"/>
+              <w:left w:w="60" w:type="dxa"/>
+              <w:right w:w="60" w:type="dxa"/>
             </w:tcMar>
             <w:shd w:fill="FAFAFA"/>
           </w:tcPr>
           <w:p>
             <w:r>
               <w:rPr>
-                <w:sz w:val="16"/>
+                <w:sz w:val="14"/>
               </w:rPr>
               <w:t>Provided city-scale thermal vulnerability mapping; lacked sub-meter building ray-tracing physics.</w:t>
             </w:r>
@@ -1053,16 +1053,16 @@
           <w:tcPr>
             <w:tcW w:type="dxa" w:w="2340"/>
             <w:tcMar>
-              <w:top w:w="60" w:type="dxa"/>
-              <w:bottom w:w="60" w:type="dxa"/>
-              <w:left w:w="90" w:type="dxa"/>
-              <w:right w:w="90" w:type="dxa"/>
+              <w:top w:w="40" w:type="dxa"/>
+              <w:bottom w:w="40" w:type="dxa"/>
+              <w:left w:w="60" w:type="dxa"/>
+              <w:right w:w="60" w:type="dxa"/>
             </w:tcMar>
           </w:tcPr>
           <w:p>
             <w:r>
               <w:rPr>
-                <w:sz w:val="16"/>
+                <w:sz w:val="14"/>
               </w:rPr>
               <w:t>Chen et al. (2024)</w:t>
             </w:r>
@@ -1072,16 +1072,16 @@
           <w:tcPr>
             <w:tcW w:type="dxa" w:w="2340"/>
             <w:tcMar>
-              <w:top w:w="60" w:type="dxa"/>
-              <w:bottom w:w="60" w:type="dxa"/>
-              <w:left w:w="90" w:type="dxa"/>
-              <w:right w:w="90" w:type="dxa"/>
+              <w:top w:w="40" w:type="dxa"/>
+              <w:bottom w:w="40" w:type="dxa"/>
+              <w:left w:w="60" w:type="dxa"/>
+              <w:right w:w="60" w:type="dxa"/>
             </w:tcMar>
           </w:tcPr>
           <w:p>
             <w:r>
               <w:rPr>
-                <w:sz w:val="16"/>
+                <w:sz w:val="14"/>
               </w:rPr>
               <w:t>Landscape and Urban Planning</w:t>
             </w:r>
@@ -1091,16 +1091,16 @@
           <w:tcPr>
             <w:tcW w:type="dxa" w:w="2340"/>
             <w:tcMar>
-              <w:top w:w="60" w:type="dxa"/>
-              <w:bottom w:w="60" w:type="dxa"/>
-              <w:left w:w="90" w:type="dxa"/>
-              <w:right w:w="90" w:type="dxa"/>
+              <w:top w:w="40" w:type="dxa"/>
+              <w:bottom w:w="40" w:type="dxa"/>
+              <w:left w:w="60" w:type="dxa"/>
+              <w:right w:w="60" w:type="dxa"/>
             </w:tcMar>
           </w:tcPr>
           <w:p>
             <w:r>
               <w:rPr>
-                <w:sz w:val="16"/>
+                <w:sz w:val="14"/>
               </w:rPr>
               <w:t>Evaluated fast microclimate modeling for spatial planning of urban green and blue spaces.</w:t>
             </w:r>
@@ -1110,16 +1110,16 @@
           <w:tcPr>
             <w:tcW w:type="dxa" w:w="2340"/>
             <w:tcMar>
-              <w:top w:w="60" w:type="dxa"/>
-              <w:bottom w:w="60" w:type="dxa"/>
-              <w:left w:w="90" w:type="dxa"/>
-              <w:right w:w="90" w:type="dxa"/>
+              <w:top w:w="40" w:type="dxa"/>
+              <w:bottom w:w="40" w:type="dxa"/>
+              <w:left w:w="60" w:type="dxa"/>
+              <w:right w:w="60" w:type="dxa"/>
             </w:tcMar>
           </w:tcPr>
           <w:p>
             <w:r>
               <w:rPr>
-                <w:sz w:val="16"/>
+                <w:sz w:val="14"/>
               </w:rPr>
               <w:t>Proved planning utility of fast radiation approximations; discarded spatial states on intervention edits.</w:t>
             </w:r>
@@ -1131,17 +1131,17 @@
           <w:tcPr>
             <w:tcW w:type="dxa" w:w="2340"/>
             <w:tcMar>
-              <w:top w:w="60" w:type="dxa"/>
-              <w:bottom w:w="60" w:type="dxa"/>
-              <w:left w:w="90" w:type="dxa"/>
-              <w:right w:w="90" w:type="dxa"/>
+              <w:top w:w="40" w:type="dxa"/>
+              <w:bottom w:w="40" w:type="dxa"/>
+              <w:left w:w="60" w:type="dxa"/>
+              <w:right w:w="60" w:type="dxa"/>
             </w:tcMar>
             <w:shd w:fill="FAFAFA"/>
           </w:tcPr>
           <w:p>
             <w:r>
               <w:rPr>
-                <w:sz w:val="16"/>
+                <w:sz w:val="14"/>
               </w:rPr>
               <w:t>Qin et al. (2024)</w:t>
             </w:r>
@@ -1151,17 +1151,17 @@
           <w:tcPr>
             <w:tcW w:type="dxa" w:w="2340"/>
             <w:tcMar>
-              <w:top w:w="60" w:type="dxa"/>
-              <w:bottom w:w="60" w:type="dxa"/>
-              <w:left w:w="90" w:type="dxa"/>
-              <w:right w:w="90" w:type="dxa"/>
+              <w:top w:w="40" w:type="dxa"/>
+              <w:bottom w:w="40" w:type="dxa"/>
+              <w:left w:w="60" w:type="dxa"/>
+              <w:right w:w="60" w:type="dxa"/>
             </w:tcMar>
             <w:shd w:fill="FAFAFA"/>
           </w:tcPr>
           <w:p>
             <w:r>
               <w:rPr>
-                <w:sz w:val="16"/>
+                <w:sz w:val="14"/>
               </w:rPr>
               <w:t>Building and Environment</w:t>
             </w:r>
@@ -1171,17 +1171,17 @@
           <w:tcPr>
             <w:tcW w:type="dxa" w:w="2340"/>
             <w:tcMar>
-              <w:top w:w="60" w:type="dxa"/>
-              <w:bottom w:w="60" w:type="dxa"/>
-              <w:left w:w="90" w:type="dxa"/>
-              <w:right w:w="90" w:type="dxa"/>
+              <w:top w:w="40" w:type="dxa"/>
+              <w:bottom w:w="40" w:type="dxa"/>
+              <w:left w:w="60" w:type="dxa"/>
+              <w:right w:w="60" w:type="dxa"/>
             </w:tcMar>
             <w:shd w:fill="FAFAFA"/>
           </w:tcPr>
           <w:p>
             <w:r>
               <w:rPr>
-                <w:sz w:val="16"/>
+                <w:sz w:val="14"/>
               </w:rPr>
               <w:t>Modeled multivariable 3D microclimates using localized Fourier Neural Operators.</w:t>
             </w:r>
@@ -1191,17 +1191,17 @@
           <w:tcPr>
             <w:tcW w:type="dxa" w:w="2340"/>
             <w:tcMar>
-              <w:top w:w="60" w:type="dxa"/>
-              <w:bottom w:w="60" w:type="dxa"/>
-              <w:left w:w="90" w:type="dxa"/>
-              <w:right w:w="90" w:type="dxa"/>
+              <w:top w:w="40" w:type="dxa"/>
+              <w:bottom w:w="40" w:type="dxa"/>
+              <w:left w:w="60" w:type="dxa"/>
+              <w:right w:w="60" w:type="dxa"/>
             </w:tcMar>
             <w:shd w:fill="FAFAFA"/>
           </w:tcPr>
           <w:p>
             <w:r>
               <w:rPr>
-                <w:sz w:val="16"/>
+                <w:sz w:val="14"/>
               </w:rPr>
               <w:t>Near real-time 3D field prediction; surrogates exhibited uncertified extrapolation errors.</w:t>
             </w:r>
@@ -1213,16 +1213,16 @@
           <w:tcPr>
             <w:tcW w:type="dxa" w:w="2340"/>
             <w:tcMar>
-              <w:top w:w="60" w:type="dxa"/>
-              <w:bottom w:w="60" w:type="dxa"/>
-              <w:left w:w="90" w:type="dxa"/>
-              <w:right w:w="90" w:type="dxa"/>
+              <w:top w:w="40" w:type="dxa"/>
+              <w:bottom w:w="40" w:type="dxa"/>
+              <w:left w:w="60" w:type="dxa"/>
+              <w:right w:w="60" w:type="dxa"/>
             </w:tcMar>
           </w:tcPr>
           <w:p>
             <w:r>
               <w:rPr>
-                <w:sz w:val="16"/>
+                <w:sz w:val="14"/>
               </w:rPr>
               <w:t>Freude et al. (2023)</w:t>
             </w:r>
@@ -1232,16 +1232,16 @@
           <w:tcPr>
             <w:tcW w:type="dxa" w:w="2340"/>
             <w:tcMar>
-              <w:top w:w="60" w:type="dxa"/>
-              <w:bottom w:w="60" w:type="dxa"/>
-              <w:left w:w="90" w:type="dxa"/>
-              <w:right w:w="90" w:type="dxa"/>
+              <w:top w:w="40" w:type="dxa"/>
+              <w:bottom w:w="40" w:type="dxa"/>
+              <w:left w:w="60" w:type="dxa"/>
+              <w:right w:w="60" w:type="dxa"/>
             </w:tcMar>
           </w:tcPr>
           <w:p>
             <w:r>
               <w:rPr>
-                <w:sz w:val="16"/>
+                <w:sz w:val="14"/>
               </w:rPr>
               <w:t>Computer Graphics Forum</w:t>
             </w:r>
@@ -1251,16 +1251,16 @@
           <w:tcPr>
             <w:tcW w:type="dxa" w:w="2340"/>
             <w:tcMar>
-              <w:top w:w="60" w:type="dxa"/>
-              <w:bottom w:w="60" w:type="dxa"/>
-              <w:left w:w="90" w:type="dxa"/>
-              <w:right w:w="90" w:type="dxa"/>
+              <w:top w:w="40" w:type="dxa"/>
+              <w:bottom w:w="40" w:type="dxa"/>
+              <w:left w:w="60" w:type="dxa"/>
+              <w:right w:w="60" w:type="dxa"/>
             </w:tcMar>
           </w:tcPr>
           <w:p>
             <w:r>
               <w:rPr>
-                <w:sz w:val="16"/>
+                <w:sz w:val="14"/>
               </w:rPr>
               <w:t>Precomputed radiative heat transport matrices to accelerate dynamic thermal simulations.</w:t>
             </w:r>
@@ -1270,16 +1270,16 @@
           <w:tcPr>
             <w:tcW w:type="dxa" w:w="2340"/>
             <w:tcMar>
-              <w:top w:w="60" w:type="dxa"/>
-              <w:bottom w:w="60" w:type="dxa"/>
-              <w:left w:w="90" w:type="dxa"/>
-              <w:right w:w="90" w:type="dxa"/>
+              <w:top w:w="40" w:type="dxa"/>
+              <w:bottom w:w="40" w:type="dxa"/>
+              <w:left w:w="60" w:type="dxa"/>
+              <w:right w:w="60" w:type="dxa"/>
             </w:tcMar>
           </w:tcPr>
           <w:p>
             <w:r>
               <w:rPr>
-                <w:sz w:val="16"/>
+                <w:sz w:val="14"/>
               </w:rPr>
               <w:t>Drastically sped up stationary geometries; alterations required full matrix recomputation.</w:t>
             </w:r>
@@ -1291,17 +1291,17 @@
           <w:tcPr>
             <w:tcW w:type="dxa" w:w="2340"/>
             <w:tcMar>
-              <w:top w:w="60" w:type="dxa"/>
-              <w:bottom w:w="60" w:type="dxa"/>
-              <w:left w:w="90" w:type="dxa"/>
-              <w:right w:w="90" w:type="dxa"/>
+              <w:top w:w="40" w:type="dxa"/>
+              <w:bottom w:w="40" w:type="dxa"/>
+              <w:left w:w="60" w:type="dxa"/>
+              <w:right w:w="60" w:type="dxa"/>
             </w:tcMar>
             <w:shd w:fill="FAFAFA"/>
           </w:tcPr>
           <w:p>
             <w:r>
               <w:rPr>
-                <w:sz w:val="16"/>
+                <w:sz w:val="14"/>
               </w:rPr>
               <w:t>Nguyen et al. (2023)</w:t>
             </w:r>
@@ -1311,17 +1311,17 @@
           <w:tcPr>
             <w:tcW w:type="dxa" w:w="2340"/>
             <w:tcMar>
-              <w:top w:w="60" w:type="dxa"/>
-              <w:bottom w:w="60" w:type="dxa"/>
-              <w:left w:w="90" w:type="dxa"/>
-              <w:right w:w="90" w:type="dxa"/>
+              <w:top w:w="40" w:type="dxa"/>
+              <w:bottom w:w="40" w:type="dxa"/>
+              <w:left w:w="60" w:type="dxa"/>
+              <w:right w:w="60" w:type="dxa"/>
             </w:tcMar>
             <w:shd w:fill="FAFAFA"/>
           </w:tcPr>
           <w:p>
             <w:r>
               <w:rPr>
-                <w:sz w:val="16"/>
+                <w:sz w:val="14"/>
               </w:rPr>
               <w:t>Earth Science Informatics</w:t>
             </w:r>
@@ -1331,17 +1331,17 @@
           <w:tcPr>
             <w:tcW w:type="dxa" w:w="2340"/>
             <w:tcMar>
-              <w:top w:w="60" w:type="dxa"/>
-              <w:bottom w:w="60" w:type="dxa"/>
-              <w:left w:w="90" w:type="dxa"/>
-              <w:right w:w="90" w:type="dxa"/>
+              <w:top w:w="40" w:type="dxa"/>
+              <w:bottom w:w="40" w:type="dxa"/>
+              <w:left w:w="60" w:type="dxa"/>
+              <w:right w:w="60" w:type="dxa"/>
             </w:tcMar>
             <w:shd w:fill="FAFAFA"/>
           </w:tcPr>
           <w:p>
             <w:r>
               <w:rPr>
-                <w:sz w:val="16"/>
+                <w:sz w:val="14"/>
               </w:rPr>
               <w:t>Developed mathematical multicriteria model for temperature-reducing potential of green spaces.</w:t>
             </w:r>
@@ -1351,17 +1351,17 @@
           <w:tcPr>
             <w:tcW w:type="dxa" w:w="2340"/>
             <w:tcMar>
-              <w:top w:w="60" w:type="dxa"/>
-              <w:bottom w:w="60" w:type="dxa"/>
-              <w:left w:w="90" w:type="dxa"/>
-              <w:right w:w="90" w:type="dxa"/>
+              <w:top w:w="40" w:type="dxa"/>
+              <w:bottom w:w="40" w:type="dxa"/>
+              <w:left w:w="60" w:type="dxa"/>
+              <w:right w:w="60" w:type="dxa"/>
             </w:tcMar>
             <w:shd w:fill="FAFAFA"/>
           </w:tcPr>
           <w:p>
             <w:r>
               <w:rPr>
-                <w:sz w:val="16"/>
+                <w:sz w:val="14"/>
               </w:rPr>
               <w:t>Ranked spatial intervention priorities; relied on empirical indices rather than 6-flux Stefan–Boltzmann physics.</w:t>
             </w:r>
@@ -1492,17 +1492,17 @@
             <w:tcW w:type="dxa" w:w="1560"/>
             <w:shd w:fill="EAEAEA"/>
             <w:tcMar>
-              <w:top w:w="70" w:type="dxa"/>
-              <w:bottom w:w="70" w:type="dxa"/>
-              <w:left w:w="80" w:type="dxa"/>
-              <w:right w:w="80" w:type="dxa"/>
+              <w:top w:w="50" w:type="dxa"/>
+              <w:bottom w:w="50" w:type="dxa"/>
+              <w:left w:w="60" w:type="dxa"/>
+              <w:right w:w="60" w:type="dxa"/>
             </w:tcMar>
           </w:tcPr>
           <w:p>
             <w:r>
               <w:rPr>
                 <w:b/>
-                <w:sz w:val="16"/>
+                <w:sz w:val="15"/>
               </w:rPr>
               <w:t>Study Area</w:t>
             </w:r>
@@ -1513,17 +1513,17 @@
             <w:tcW w:type="dxa" w:w="1560"/>
             <w:shd w:fill="EAEAEA"/>
             <w:tcMar>
-              <w:top w:w="70" w:type="dxa"/>
-              <w:bottom w:w="70" w:type="dxa"/>
-              <w:left w:w="80" w:type="dxa"/>
-              <w:right w:w="80" w:type="dxa"/>
+              <w:top w:w="50" w:type="dxa"/>
+              <w:bottom w:w="50" w:type="dxa"/>
+              <w:left w:w="60" w:type="dxa"/>
+              <w:right w:w="60" w:type="dxa"/>
             </w:tcMar>
           </w:tcPr>
           <w:p>
             <w:r>
               <w:rPr>
                 <w:b/>
-                <w:sz w:val="16"/>
+                <w:sz w:val="15"/>
               </w:rPr>
               <w:t>Layer</w:t>
             </w:r>
@@ -1534,17 +1534,17 @@
             <w:tcW w:type="dxa" w:w="1560"/>
             <w:shd w:fill="EAEAEA"/>
             <w:tcMar>
-              <w:top w:w="70" w:type="dxa"/>
-              <w:bottom w:w="70" w:type="dxa"/>
-              <w:left w:w="80" w:type="dxa"/>
-              <w:right w:w="80" w:type="dxa"/>
+              <w:top w:w="50" w:type="dxa"/>
+              <w:bottom w:w="50" w:type="dxa"/>
+              <w:left w:w="60" w:type="dxa"/>
+              <w:right w:w="60" w:type="dxa"/>
             </w:tcMar>
           </w:tcPr>
           <w:p>
             <w:r>
               <w:rPr>
                 <w:b/>
-                <w:sz w:val="16"/>
+                <w:sz w:val="15"/>
               </w:rPr>
               <w:t>Dataset &amp; Source Authority</w:t>
             </w:r>
@@ -1555,17 +1555,17 @@
             <w:tcW w:type="dxa" w:w="1560"/>
             <w:shd w:fill="EAEAEA"/>
             <w:tcMar>
-              <w:top w:w="70" w:type="dxa"/>
-              <w:bottom w:w="70" w:type="dxa"/>
-              <w:left w:w="80" w:type="dxa"/>
-              <w:right w:w="80" w:type="dxa"/>
+              <w:top w:w="50" w:type="dxa"/>
+              <w:bottom w:w="50" w:type="dxa"/>
+              <w:left w:w="60" w:type="dxa"/>
+              <w:right w:w="60" w:type="dxa"/>
             </w:tcMar>
           </w:tcPr>
           <w:p>
             <w:r>
               <w:rPr>
                 <w:b/>
-                <w:sz w:val="16"/>
+                <w:sz w:val="15"/>
               </w:rPr>
               <w:t>Repository / Access Link</w:t>
             </w:r>
@@ -1576,17 +1576,17 @@
             <w:tcW w:type="dxa" w:w="1560"/>
             <w:shd w:fill="EAEAEA"/>
             <w:tcMar>
-              <w:top w:w="70" w:type="dxa"/>
-              <w:bottom w:w="70" w:type="dxa"/>
-              <w:left w:w="80" w:type="dxa"/>
-              <w:right w:w="80" w:type="dxa"/>
+              <w:top w:w="50" w:type="dxa"/>
+              <w:bottom w:w="50" w:type="dxa"/>
+              <w:left w:w="60" w:type="dxa"/>
+              <w:right w:w="60" w:type="dxa"/>
             </w:tcMar>
           </w:tcPr>
           <w:p>
             <w:r>
               <w:rPr>
                 <w:b/>
-                <w:sz w:val="16"/>
+                <w:sz w:val="15"/>
               </w:rPr>
               <w:t>Licence</w:t>
             </w:r>
@@ -1597,17 +1597,17 @@
             <w:tcW w:type="dxa" w:w="1560"/>
             <w:shd w:fill="EAEAEA"/>
             <w:tcMar>
-              <w:top w:w="70" w:type="dxa"/>
-              <w:bottom w:w="70" w:type="dxa"/>
-              <w:left w:w="80" w:type="dxa"/>
-              <w:right w:w="80" w:type="dxa"/>
+              <w:top w:w="50" w:type="dxa"/>
+              <w:bottom w:w="50" w:type="dxa"/>
+              <w:left w:w="60" w:type="dxa"/>
+              <w:right w:w="60" w:type="dxa"/>
             </w:tcMar>
           </w:tcPr>
           <w:p>
             <w:r>
               <w:rPr>
                 <w:b/>
-                <w:sz w:val="16"/>
+                <w:sz w:val="15"/>
               </w:rPr>
               <w:t>Access Date</w:t>
             </w:r>
@@ -1619,16 +1619,16 @@
           <w:tcPr>
             <w:tcW w:type="dxa" w:w="1560"/>
             <w:tcMar>
-              <w:top w:w="50" w:type="dxa"/>
-              <w:bottom w:w="50" w:type="dxa"/>
-              <w:left w:w="70" w:type="dxa"/>
-              <w:right w:w="70" w:type="dxa"/>
+              <w:top w:w="35" w:type="dxa"/>
+              <w:bottom w:w="35" w:type="dxa"/>
+              <w:left w:w="50" w:type="dxa"/>
+              <w:right w:w="50" w:type="dxa"/>
             </w:tcMar>
           </w:tcPr>
           <w:p>
             <w:r>
               <w:rPr>
-                <w:sz w:val="15"/>
+                <w:sz w:val="13"/>
               </w:rPr>
               <w:t>Berlin</w:t>
             </w:r>
@@ -1638,16 +1638,16 @@
           <w:tcPr>
             <w:tcW w:type="dxa" w:w="1560"/>
             <w:tcMar>
-              <w:top w:w="50" w:type="dxa"/>
-              <w:bottom w:w="50" w:type="dxa"/>
-              <w:left w:w="70" w:type="dxa"/>
-              <w:right w:w="70" w:type="dxa"/>
+              <w:top w:w="35" w:type="dxa"/>
+              <w:bottom w:w="35" w:type="dxa"/>
+              <w:left w:w="50" w:type="dxa"/>
+              <w:right w:w="50" w:type="dxa"/>
             </w:tcMar>
           </w:tcPr>
           <w:p>
             <w:r>
               <w:rPr>
-                <w:sz w:val="15"/>
+                <w:sz w:val="13"/>
               </w:rPr>
               <w:t>Buildings</w:t>
             </w:r>
@@ -1657,16 +1657,16 @@
           <w:tcPr>
             <w:tcW w:type="dxa" w:w="1560"/>
             <w:tcMar>
-              <w:top w:w="50" w:type="dxa"/>
-              <w:bottom w:w="50" w:type="dxa"/>
-              <w:left w:w="70" w:type="dxa"/>
-              <w:right w:w="70" w:type="dxa"/>
+              <w:top w:w="35" w:type="dxa"/>
+              <w:bottom w:w="35" w:type="dxa"/>
+              <w:left w:w="50" w:type="dxa"/>
+              <w:right w:w="50" w:type="dxa"/>
             </w:tcMar>
           </w:tcPr>
           <w:p>
             <w:r>
               <w:rPr>
-                <w:sz w:val="15"/>
+                <w:sz w:val="13"/>
               </w:rPr>
               <w:t>Geoportal Berlin LoD2 CityGML (Senatsverwaltung für Stadtentwicklung)</w:t>
             </w:r>
@@ -1676,16 +1676,16 @@
           <w:tcPr>
             <w:tcW w:type="dxa" w:w="1560"/>
             <w:tcMar>
-              <w:top w:w="50" w:type="dxa"/>
-              <w:bottom w:w="50" w:type="dxa"/>
-              <w:left w:w="70" w:type="dxa"/>
-              <w:right w:w="70" w:type="dxa"/>
+              <w:top w:w="35" w:type="dxa"/>
+              <w:bottom w:w="35" w:type="dxa"/>
+              <w:left w:w="50" w:type="dxa"/>
+              <w:right w:w="50" w:type="dxa"/>
             </w:tcMar>
           </w:tcPr>
           <w:p>
             <w:r>
               <w:rPr>
-                <w:sz w:val="15"/>
+                <w:sz w:val="13"/>
               </w:rPr>
               <w:t>https://daten.berlin.de/datensaetze/geoportal-berlin-3d-gebaeudedaten</w:t>
             </w:r>
@@ -1695,16 +1695,16 @@
           <w:tcPr>
             <w:tcW w:type="dxa" w:w="1560"/>
             <w:tcMar>
-              <w:top w:w="50" w:type="dxa"/>
-              <w:bottom w:w="50" w:type="dxa"/>
-              <w:left w:w="70" w:type="dxa"/>
-              <w:right w:w="70" w:type="dxa"/>
+              <w:top w:w="35" w:type="dxa"/>
+              <w:bottom w:w="35" w:type="dxa"/>
+              <w:left w:w="50" w:type="dxa"/>
+              <w:right w:w="50" w:type="dxa"/>
             </w:tcMar>
           </w:tcPr>
           <w:p>
             <w:r>
               <w:rPr>
-                <w:sz w:val="15"/>
+                <w:sz w:val="13"/>
               </w:rPr>
               <w:t>dl-de/by-2-0</w:t>
             </w:r>
@@ -1714,16 +1714,16 @@
           <w:tcPr>
             <w:tcW w:type="dxa" w:w="1560"/>
             <w:tcMar>
-              <w:top w:w="50" w:type="dxa"/>
-              <w:bottom w:w="50" w:type="dxa"/>
-              <w:left w:w="70" w:type="dxa"/>
-              <w:right w:w="70" w:type="dxa"/>
+              <w:top w:w="35" w:type="dxa"/>
+              <w:bottom w:w="35" w:type="dxa"/>
+              <w:left w:w="50" w:type="dxa"/>
+              <w:right w:w="50" w:type="dxa"/>
             </w:tcMar>
           </w:tcPr>
           <w:p>
             <w:r>
               <w:rPr>
-                <w:sz w:val="15"/>
+                <w:sz w:val="13"/>
               </w:rPr>
               <w:t>2026-10-13</w:t>
             </w:r>
@@ -1735,17 +1735,17 @@
           <w:tcPr>
             <w:tcW w:type="dxa" w:w="1560"/>
             <w:tcMar>
-              <w:top w:w="50" w:type="dxa"/>
-              <w:bottom w:w="50" w:type="dxa"/>
-              <w:left w:w="70" w:type="dxa"/>
-              <w:right w:w="70" w:type="dxa"/>
+              <w:top w:w="35" w:type="dxa"/>
+              <w:bottom w:w="35" w:type="dxa"/>
+              <w:left w:w="50" w:type="dxa"/>
+              <w:right w:w="50" w:type="dxa"/>
             </w:tcMar>
             <w:shd w:fill="FAFAFA"/>
           </w:tcPr>
           <w:p>
             <w:r>
               <w:rPr>
-                <w:sz w:val="15"/>
+                <w:sz w:val="13"/>
               </w:rPr>
               <w:t>Berlin</w:t>
             </w:r>
@@ -1755,17 +1755,17 @@
           <w:tcPr>
             <w:tcW w:type="dxa" w:w="1560"/>
             <w:tcMar>
-              <w:top w:w="50" w:type="dxa"/>
-              <w:bottom w:w="50" w:type="dxa"/>
-              <w:left w:w="70" w:type="dxa"/>
-              <w:right w:w="70" w:type="dxa"/>
+              <w:top w:w="35" w:type="dxa"/>
+              <w:bottom w:w="35" w:type="dxa"/>
+              <w:left w:w="50" w:type="dxa"/>
+              <w:right w:w="50" w:type="dxa"/>
             </w:tcMar>
             <w:shd w:fill="FAFAFA"/>
           </w:tcPr>
           <w:p>
             <w:r>
               <w:rPr>
-                <w:sz w:val="15"/>
+                <w:sz w:val="13"/>
               </w:rPr>
               <w:t>Terrain</w:t>
             </w:r>
@@ -1775,17 +1775,17 @@
           <w:tcPr>
             <w:tcW w:type="dxa" w:w="1560"/>
             <w:tcMar>
-              <w:top w:w="50" w:type="dxa"/>
-              <w:bottom w:w="50" w:type="dxa"/>
-              <w:left w:w="70" w:type="dxa"/>
-              <w:right w:w="70" w:type="dxa"/>
+              <w:top w:w="35" w:type="dxa"/>
+              <w:bottom w:w="35" w:type="dxa"/>
+              <w:left w:w="50" w:type="dxa"/>
+              <w:right w:w="50" w:type="dxa"/>
             </w:tcMar>
             <w:shd w:fill="FAFAFA"/>
           </w:tcPr>
           <w:p>
             <w:r>
               <w:rPr>
-                <w:sz w:val="15"/>
+                <w:sz w:val="13"/>
               </w:rPr>
               <w:t>Digitales Geländemodell DGM 1m (Geoportal Berlin)</w:t>
             </w:r>
@@ -1795,17 +1795,17 @@
           <w:tcPr>
             <w:tcW w:type="dxa" w:w="1560"/>
             <w:tcMar>
-              <w:top w:w="50" w:type="dxa"/>
-              <w:bottom w:w="50" w:type="dxa"/>
-              <w:left w:w="70" w:type="dxa"/>
-              <w:right w:w="70" w:type="dxa"/>
+              <w:top w:w="35" w:type="dxa"/>
+              <w:bottom w:w="35" w:type="dxa"/>
+              <w:left w:w="50" w:type="dxa"/>
+              <w:right w:w="50" w:type="dxa"/>
             </w:tcMar>
             <w:shd w:fill="FAFAFA"/>
           </w:tcPr>
           <w:p>
             <w:r>
               <w:rPr>
-                <w:sz w:val="15"/>
+                <w:sz w:val="13"/>
               </w:rPr>
               <w:t>https://daten.berlin.de/datensaetze/digitales-gelaendemodell-dgm-1-m</w:t>
             </w:r>
@@ -1815,17 +1815,17 @@
           <w:tcPr>
             <w:tcW w:type="dxa" w:w="1560"/>
             <w:tcMar>
-              <w:top w:w="50" w:type="dxa"/>
-              <w:bottom w:w="50" w:type="dxa"/>
-              <w:left w:w="70" w:type="dxa"/>
-              <w:right w:w="70" w:type="dxa"/>
+              <w:top w:w="35" w:type="dxa"/>
+              <w:bottom w:w="35" w:type="dxa"/>
+              <w:left w:w="50" w:type="dxa"/>
+              <w:right w:w="50" w:type="dxa"/>
             </w:tcMar>
             <w:shd w:fill="FAFAFA"/>
           </w:tcPr>
           <w:p>
             <w:r>
               <w:rPr>
-                <w:sz w:val="15"/>
+                <w:sz w:val="13"/>
               </w:rPr>
               <w:t>dl-de/by-2-0</w:t>
             </w:r>
@@ -1835,17 +1835,17 @@
           <w:tcPr>
             <w:tcW w:type="dxa" w:w="1560"/>
             <w:tcMar>
-              <w:top w:w="50" w:type="dxa"/>
-              <w:bottom w:w="50" w:type="dxa"/>
-              <w:left w:w="70" w:type="dxa"/>
-              <w:right w:w="70" w:type="dxa"/>
+              <w:top w:w="35" w:type="dxa"/>
+              <w:bottom w:w="35" w:type="dxa"/>
+              <w:left w:w="50" w:type="dxa"/>
+              <w:right w:w="50" w:type="dxa"/>
             </w:tcMar>
             <w:shd w:fill="FAFAFA"/>
           </w:tcPr>
           <w:p>
             <w:r>
               <w:rPr>
-                <w:sz w:val="15"/>
+                <w:sz w:val="13"/>
               </w:rPr>
               <w:t>2026-10-13</w:t>
             </w:r>
@@ -1857,16 +1857,16 @@
           <w:tcPr>
             <w:tcW w:type="dxa" w:w="1560"/>
             <w:tcMar>
-              <w:top w:w="50" w:type="dxa"/>
-              <w:bottom w:w="50" w:type="dxa"/>
-              <w:left w:w="70" w:type="dxa"/>
-              <w:right w:w="70" w:type="dxa"/>
+              <w:top w:w="35" w:type="dxa"/>
+              <w:bottom w:w="35" w:type="dxa"/>
+              <w:left w:w="50" w:type="dxa"/>
+              <w:right w:w="50" w:type="dxa"/>
             </w:tcMar>
           </w:tcPr>
           <w:p>
             <w:r>
               <w:rPr>
-                <w:sz w:val="15"/>
+                <w:sz w:val="13"/>
               </w:rPr>
               <w:t>Berlin</w:t>
             </w:r>
@@ -1876,16 +1876,16 @@
           <w:tcPr>
             <w:tcW w:type="dxa" w:w="1560"/>
             <w:tcMar>
-              <w:top w:w="50" w:type="dxa"/>
-              <w:bottom w:w="50" w:type="dxa"/>
-              <w:left w:w="70" w:type="dxa"/>
-              <w:right w:w="70" w:type="dxa"/>
+              <w:top w:w="35" w:type="dxa"/>
+              <w:bottom w:w="35" w:type="dxa"/>
+              <w:left w:w="50" w:type="dxa"/>
+              <w:right w:w="50" w:type="dxa"/>
             </w:tcMar>
           </w:tcPr>
           <w:p>
             <w:r>
               <w:rPr>
-                <w:sz w:val="15"/>
+                <w:sz w:val="13"/>
               </w:rPr>
               <w:t>Vegetation</w:t>
             </w:r>
@@ -1895,16 +1895,16 @@
           <w:tcPr>
             <w:tcW w:type="dxa" w:w="1560"/>
             <w:tcMar>
-              <w:top w:w="50" w:type="dxa"/>
-              <w:bottom w:w="50" w:type="dxa"/>
-              <w:left w:w="70" w:type="dxa"/>
-              <w:right w:w="70" w:type="dxa"/>
+              <w:top w:w="35" w:type="dxa"/>
+              <w:bottom w:w="35" w:type="dxa"/>
+              <w:left w:w="50" w:type="dxa"/>
+              <w:right w:w="50" w:type="dxa"/>
             </w:tcMar>
           </w:tcPr>
           <w:p>
             <w:r>
               <w:rPr>
-                <w:sz w:val="15"/>
+                <w:sz w:val="13"/>
               </w:rPr>
               <w:t>Baumbestand Berlin – Straßenbäume (16 roadside Tilia cordata)</w:t>
             </w:r>
@@ -1914,16 +1914,16 @@
           <w:tcPr>
             <w:tcW w:type="dxa" w:w="1560"/>
             <w:tcMar>
-              <w:top w:w="50" w:type="dxa"/>
-              <w:bottom w:w="50" w:type="dxa"/>
-              <w:left w:w="70" w:type="dxa"/>
-              <w:right w:w="70" w:type="dxa"/>
+              <w:top w:w="35" w:type="dxa"/>
+              <w:bottom w:w="35" w:type="dxa"/>
+              <w:left w:w="50" w:type="dxa"/>
+              <w:right w:w="50" w:type="dxa"/>
             </w:tcMar>
           </w:tcPr>
           <w:p>
             <w:r>
               <w:rPr>
-                <w:sz w:val="15"/>
+                <w:sz w:val="13"/>
               </w:rPr>
               <w:t>https://daten.berlin.de/datensaetze/baumbestand-berlin-strassenbaeume</w:t>
             </w:r>
@@ -1933,16 +1933,16 @@
           <w:tcPr>
             <w:tcW w:type="dxa" w:w="1560"/>
             <w:tcMar>
-              <w:top w:w="50" w:type="dxa"/>
-              <w:bottom w:w="50" w:type="dxa"/>
-              <w:left w:w="70" w:type="dxa"/>
-              <w:right w:w="70" w:type="dxa"/>
+              <w:top w:w="35" w:type="dxa"/>
+              <w:bottom w:w="35" w:type="dxa"/>
+              <w:left w:w="50" w:type="dxa"/>
+              <w:right w:w="50" w:type="dxa"/>
             </w:tcMar>
           </w:tcPr>
           <w:p>
             <w:r>
               <w:rPr>
-                <w:sz w:val="15"/>
+                <w:sz w:val="13"/>
               </w:rPr>
               <w:t>dl-de/by-2-0</w:t>
             </w:r>
@@ -1952,16 +1952,16 @@
           <w:tcPr>
             <w:tcW w:type="dxa" w:w="1560"/>
             <w:tcMar>
-              <w:top w:w="50" w:type="dxa"/>
-              <w:bottom w:w="50" w:type="dxa"/>
-              <w:left w:w="70" w:type="dxa"/>
-              <w:right w:w="70" w:type="dxa"/>
+              <w:top w:w="35" w:type="dxa"/>
+              <w:bottom w:w="35" w:type="dxa"/>
+              <w:left w:w="50" w:type="dxa"/>
+              <w:right w:w="50" w:type="dxa"/>
             </w:tcMar>
           </w:tcPr>
           <w:p>
             <w:r>
               <w:rPr>
-                <w:sz w:val="15"/>
+                <w:sz w:val="13"/>
               </w:rPr>
               <w:t>2026-10-13</w:t>
             </w:r>
@@ -1973,17 +1973,17 @@
           <w:tcPr>
             <w:tcW w:type="dxa" w:w="1560"/>
             <w:tcMar>
-              <w:top w:w="50" w:type="dxa"/>
-              <w:bottom w:w="50" w:type="dxa"/>
-              <w:left w:w="70" w:type="dxa"/>
-              <w:right w:w="70" w:type="dxa"/>
+              <w:top w:w="35" w:type="dxa"/>
+              <w:bottom w:w="35" w:type="dxa"/>
+              <w:left w:w="50" w:type="dxa"/>
+              <w:right w:w="50" w:type="dxa"/>
             </w:tcMar>
             <w:shd w:fill="FAFAFA"/>
           </w:tcPr>
           <w:p>
             <w:r>
               <w:rPr>
-                <w:sz w:val="15"/>
+                <w:sz w:val="13"/>
               </w:rPr>
               <w:t>Berlin</w:t>
             </w:r>
@@ -1993,17 +1993,17 @@
           <w:tcPr>
             <w:tcW w:type="dxa" w:w="1560"/>
             <w:tcMar>
-              <w:top w:w="50" w:type="dxa"/>
-              <w:bottom w:w="50" w:type="dxa"/>
-              <w:left w:w="70" w:type="dxa"/>
-              <w:right w:w="70" w:type="dxa"/>
+              <w:top w:w="35" w:type="dxa"/>
+              <w:bottom w:w="35" w:type="dxa"/>
+              <w:left w:w="50" w:type="dxa"/>
+              <w:right w:w="50" w:type="dxa"/>
             </w:tcMar>
             <w:shd w:fill="FAFAFA"/>
           </w:tcPr>
           <w:p>
             <w:r>
               <w:rPr>
-                <w:sz w:val="15"/>
+                <w:sz w:val="13"/>
               </w:rPr>
               <w:t>Weather</w:t>
             </w:r>
@@ -2013,17 +2013,17 @@
           <w:tcPr>
             <w:tcW w:type="dxa" w:w="1560"/>
             <w:tcMar>
-              <w:top w:w="50" w:type="dxa"/>
-              <w:bottom w:w="50" w:type="dxa"/>
-              <w:left w:w="70" w:type="dxa"/>
-              <w:right w:w="70" w:type="dxa"/>
+              <w:top w:w="35" w:type="dxa"/>
+              <w:bottom w:w="35" w:type="dxa"/>
+              <w:left w:w="50" w:type="dxa"/>
+              <w:right w:w="50" w:type="dxa"/>
             </w:tcMar>
             <w:shd w:fill="FAFAFA"/>
           </w:tcPr>
           <w:p>
             <w:r>
               <w:rPr>
-                <w:sz w:val="15"/>
+                <w:sz w:val="13"/>
               </w:rPr>
               <w:t>DWD Station 00433 Tempelhof (2023-07-09 Heatwave, peak Ta=32.1°C)</w:t>
             </w:r>
@@ -2033,17 +2033,17 @@
           <w:tcPr>
             <w:tcW w:type="dxa" w:w="1560"/>
             <w:tcMar>
-              <w:top w:w="50" w:type="dxa"/>
-              <w:bottom w:w="50" w:type="dxa"/>
-              <w:left w:w="70" w:type="dxa"/>
-              <w:right w:w="70" w:type="dxa"/>
+              <w:top w:w="35" w:type="dxa"/>
+              <w:bottom w:w="35" w:type="dxa"/>
+              <w:left w:w="50" w:type="dxa"/>
+              <w:right w:w="50" w:type="dxa"/>
             </w:tcMar>
             <w:shd w:fill="FAFAFA"/>
           </w:tcPr>
           <w:p>
             <w:r>
               <w:rPr>
-                <w:sz w:val="15"/>
+                <w:sz w:val="13"/>
               </w:rPr>
               <w:t>https://opendata.dwd.de/climate_environment/CDC/</w:t>
             </w:r>
@@ -2053,17 +2053,17 @@
           <w:tcPr>
             <w:tcW w:type="dxa" w:w="1560"/>
             <w:tcMar>
-              <w:top w:w="50" w:type="dxa"/>
-              <w:bottom w:w="50" w:type="dxa"/>
-              <w:left w:w="70" w:type="dxa"/>
-              <w:right w:w="70" w:type="dxa"/>
+              <w:top w:w="35" w:type="dxa"/>
+              <w:bottom w:w="35" w:type="dxa"/>
+              <w:left w:w="50" w:type="dxa"/>
+              <w:right w:w="50" w:type="dxa"/>
             </w:tcMar>
             <w:shd w:fill="FAFAFA"/>
           </w:tcPr>
           <w:p>
             <w:r>
               <w:rPr>
-                <w:sz w:val="15"/>
+                <w:sz w:val="13"/>
               </w:rPr>
               <w:t>Open Data / DWD Law</w:t>
             </w:r>
@@ -2073,17 +2073,17 @@
           <w:tcPr>
             <w:tcW w:type="dxa" w:w="1560"/>
             <w:tcMar>
-              <w:top w:w="50" w:type="dxa"/>
-              <w:bottom w:w="50" w:type="dxa"/>
-              <w:left w:w="70" w:type="dxa"/>
-              <w:right w:w="70" w:type="dxa"/>
+              <w:top w:w="35" w:type="dxa"/>
+              <w:bottom w:w="35" w:type="dxa"/>
+              <w:left w:w="50" w:type="dxa"/>
+              <w:right w:w="50" w:type="dxa"/>
             </w:tcMar>
             <w:shd w:fill="FAFAFA"/>
           </w:tcPr>
           <w:p>
             <w:r>
               <w:rPr>
-                <w:sz w:val="15"/>
+                <w:sz w:val="13"/>
               </w:rPr>
               <w:t>2026-10-13</w:t>
             </w:r>
@@ -2095,16 +2095,16 @@
           <w:tcPr>
             <w:tcW w:type="dxa" w:w="1560"/>
             <w:tcMar>
-              <w:top w:w="50" w:type="dxa"/>
-              <w:bottom w:w="50" w:type="dxa"/>
-              <w:left w:w="70" w:type="dxa"/>
-              <w:right w:w="70" w:type="dxa"/>
+              <w:top w:w="35" w:type="dxa"/>
+              <w:bottom w:w="35" w:type="dxa"/>
+              <w:left w:w="50" w:type="dxa"/>
+              <w:right w:w="50" w:type="dxa"/>
             </w:tcMar>
           </w:tcPr>
           <w:p>
             <w:r>
               <w:rPr>
-                <w:sz w:val="15"/>
+                <w:sz w:val="13"/>
               </w:rPr>
               <w:t>Chicago</w:t>
             </w:r>
@@ -2114,16 +2114,16 @@
           <w:tcPr>
             <w:tcW w:type="dxa" w:w="1560"/>
             <w:tcMar>
-              <w:top w:w="50" w:type="dxa"/>
-              <w:bottom w:w="50" w:type="dxa"/>
-              <w:left w:w="70" w:type="dxa"/>
-              <w:right w:w="70" w:type="dxa"/>
+              <w:top w:w="35" w:type="dxa"/>
+              <w:bottom w:w="35" w:type="dxa"/>
+              <w:left w:w="50" w:type="dxa"/>
+              <w:right w:w="50" w:type="dxa"/>
             </w:tcMar>
           </w:tcPr>
           <w:p>
             <w:r>
               <w:rPr>
-                <w:sz w:val="15"/>
+                <w:sz w:val="13"/>
               </w:rPr>
               <w:t>Buildings</w:t>
             </w:r>
@@ -2133,16 +2133,16 @@
           <w:tcPr>
             <w:tcW w:type="dxa" w:w="1560"/>
             <w:tcMar>
-              <w:top w:w="50" w:type="dxa"/>
-              <w:bottom w:w="50" w:type="dxa"/>
-              <w:left w:w="70" w:type="dxa"/>
-              <w:right w:w="70" w:type="dxa"/>
+              <w:top w:w="35" w:type="dxa"/>
+              <w:bottom w:w="35" w:type="dxa"/>
+              <w:left w:w="50" w:type="dxa"/>
+              <w:right w:w="50" w:type="dxa"/>
             </w:tcMar>
           </w:tcPr>
           <w:p>
             <w:r>
               <w:rPr>
-                <w:sz w:val="15"/>
+                <w:sz w:val="13"/>
               </w:rPr>
               <w:t>City of Chicago Open Data Portal Building Footprints</w:t>
             </w:r>
@@ -2152,16 +2152,16 @@
           <w:tcPr>
             <w:tcW w:type="dxa" w:w="1560"/>
             <w:tcMar>
-              <w:top w:w="50" w:type="dxa"/>
-              <w:bottom w:w="50" w:type="dxa"/>
-              <w:left w:w="70" w:type="dxa"/>
-              <w:right w:w="70" w:type="dxa"/>
+              <w:top w:w="35" w:type="dxa"/>
+              <w:bottom w:w="35" w:type="dxa"/>
+              <w:left w:w="50" w:type="dxa"/>
+              <w:right w:w="50" w:type="dxa"/>
             </w:tcMar>
           </w:tcPr>
           <w:p>
             <w:r>
               <w:rPr>
-                <w:sz w:val="15"/>
+                <w:sz w:val="13"/>
               </w:rPr>
               <w:t>https://data.cityofchicago.org/Buildings/Building-Footprints/</w:t>
             </w:r>
@@ -2171,16 +2171,16 @@
           <w:tcPr>
             <w:tcW w:type="dxa" w:w="1560"/>
             <w:tcMar>
-              <w:top w:w="50" w:type="dxa"/>
-              <w:bottom w:w="50" w:type="dxa"/>
-              <w:left w:w="70" w:type="dxa"/>
-              <w:right w:w="70" w:type="dxa"/>
+              <w:top w:w="35" w:type="dxa"/>
+              <w:bottom w:w="35" w:type="dxa"/>
+              <w:left w:w="50" w:type="dxa"/>
+              <w:right w:w="50" w:type="dxa"/>
             </w:tcMar>
           </w:tcPr>
           <w:p>
             <w:r>
               <w:rPr>
-                <w:sz w:val="15"/>
+                <w:sz w:val="13"/>
               </w:rPr>
               <w:t>Public Domain</w:t>
             </w:r>
@@ -2190,16 +2190,16 @@
           <w:tcPr>
             <w:tcW w:type="dxa" w:w="1560"/>
             <w:tcMar>
-              <w:top w:w="50" w:type="dxa"/>
-              <w:bottom w:w="50" w:type="dxa"/>
-              <w:left w:w="70" w:type="dxa"/>
-              <w:right w:w="70" w:type="dxa"/>
+              <w:top w:w="35" w:type="dxa"/>
+              <w:bottom w:w="35" w:type="dxa"/>
+              <w:left w:w="50" w:type="dxa"/>
+              <w:right w:w="50" w:type="dxa"/>
             </w:tcMar>
           </w:tcPr>
           <w:p>
             <w:r>
               <w:rPr>
-                <w:sz w:val="15"/>
+                <w:sz w:val="13"/>
               </w:rPr>
               <w:t>2026-10-13</w:t>
             </w:r>
@@ -2211,17 +2211,17 @@
           <w:tcPr>
             <w:tcW w:type="dxa" w:w="1560"/>
             <w:tcMar>
-              <w:top w:w="50" w:type="dxa"/>
-              <w:bottom w:w="50" w:type="dxa"/>
-              <w:left w:w="70" w:type="dxa"/>
-              <w:right w:w="70" w:type="dxa"/>
+              <w:top w:w="35" w:type="dxa"/>
+              <w:bottom w:w="35" w:type="dxa"/>
+              <w:left w:w="50" w:type="dxa"/>
+              <w:right w:w="50" w:type="dxa"/>
             </w:tcMar>
             <w:shd w:fill="FAFAFA"/>
           </w:tcPr>
           <w:p>
             <w:r>
               <w:rPr>
-                <w:sz w:val="15"/>
+                <w:sz w:val="13"/>
               </w:rPr>
               <w:t>Chicago</w:t>
             </w:r>
@@ -2231,17 +2231,17 @@
           <w:tcPr>
             <w:tcW w:type="dxa" w:w="1560"/>
             <w:tcMar>
-              <w:top w:w="50" w:type="dxa"/>
-              <w:bottom w:w="50" w:type="dxa"/>
-              <w:left w:w="70" w:type="dxa"/>
-              <w:right w:w="70" w:type="dxa"/>
+              <w:top w:w="35" w:type="dxa"/>
+              <w:bottom w:w="35" w:type="dxa"/>
+              <w:left w:w="50" w:type="dxa"/>
+              <w:right w:w="50" w:type="dxa"/>
             </w:tcMar>
             <w:shd w:fill="FAFAFA"/>
           </w:tcPr>
           <w:p>
             <w:r>
               <w:rPr>
-                <w:sz w:val="15"/>
+                <w:sz w:val="13"/>
               </w:rPr>
               <w:t>Terrain</w:t>
             </w:r>
@@ -2251,17 +2251,17 @@
           <w:tcPr>
             <w:tcW w:type="dxa" w:w="1560"/>
             <w:tcMar>
-              <w:top w:w="50" w:type="dxa"/>
-              <w:bottom w:w="50" w:type="dxa"/>
-              <w:left w:w="70" w:type="dxa"/>
-              <w:right w:w="70" w:type="dxa"/>
+              <w:top w:w="35" w:type="dxa"/>
+              <w:bottom w:w="35" w:type="dxa"/>
+              <w:left w:w="50" w:type="dxa"/>
+              <w:right w:w="50" w:type="dxa"/>
             </w:tcMar>
             <w:shd w:fill="FAFAFA"/>
           </w:tcPr>
           <w:p>
             <w:r>
               <w:rPr>
-                <w:sz w:val="15"/>
+                <w:sz w:val="13"/>
               </w:rPr>
               <w:t>USGS 3D Elevation Program (3DEP) 1m Bare-Earth DEM</w:t>
             </w:r>
@@ -2271,17 +2271,17 @@
           <w:tcPr>
             <w:tcW w:type="dxa" w:w="1560"/>
             <w:tcMar>
-              <w:top w:w="50" w:type="dxa"/>
-              <w:bottom w:w="50" w:type="dxa"/>
-              <w:left w:w="70" w:type="dxa"/>
-              <w:right w:w="70" w:type="dxa"/>
+              <w:top w:w="35" w:type="dxa"/>
+              <w:bottom w:w="35" w:type="dxa"/>
+              <w:left w:w="50" w:type="dxa"/>
+              <w:right w:w="50" w:type="dxa"/>
             </w:tcMar>
             <w:shd w:fill="FAFAFA"/>
           </w:tcPr>
           <w:p>
             <w:r>
               <w:rPr>
-                <w:sz w:val="15"/>
+                <w:sz w:val="13"/>
               </w:rPr>
               <w:t>https://www.usgs.gov/3d-elevation-program</w:t>
             </w:r>
@@ -2291,17 +2291,17 @@
           <w:tcPr>
             <w:tcW w:type="dxa" w:w="1560"/>
             <w:tcMar>
-              <w:top w:w="50" w:type="dxa"/>
-              <w:bottom w:w="50" w:type="dxa"/>
-              <w:left w:w="70" w:type="dxa"/>
-              <w:right w:w="70" w:type="dxa"/>
+              <w:top w:w="35" w:type="dxa"/>
+              <w:bottom w:w="35" w:type="dxa"/>
+              <w:left w:w="50" w:type="dxa"/>
+              <w:right w:w="50" w:type="dxa"/>
             </w:tcMar>
             <w:shd w:fill="FAFAFA"/>
           </w:tcPr>
           <w:p>
             <w:r>
               <w:rPr>
-                <w:sz w:val="15"/>
+                <w:sz w:val="13"/>
               </w:rPr>
               <w:t>Public Domain (US Gov)</w:t>
             </w:r>
@@ -2311,17 +2311,17 @@
           <w:tcPr>
             <w:tcW w:type="dxa" w:w="1560"/>
             <w:tcMar>
-              <w:top w:w="50" w:type="dxa"/>
-              <w:bottom w:w="50" w:type="dxa"/>
-              <w:left w:w="70" w:type="dxa"/>
-              <w:right w:w="70" w:type="dxa"/>
+              <w:top w:w="35" w:type="dxa"/>
+              <w:bottom w:w="35" w:type="dxa"/>
+              <w:left w:w="50" w:type="dxa"/>
+              <w:right w:w="50" w:type="dxa"/>
             </w:tcMar>
             <w:shd w:fill="FAFAFA"/>
           </w:tcPr>
           <w:p>
             <w:r>
               <w:rPr>
-                <w:sz w:val="15"/>
+                <w:sz w:val="13"/>
               </w:rPr>
               <w:t>2026-10-13</w:t>
             </w:r>
@@ -2333,16 +2333,16 @@
           <w:tcPr>
             <w:tcW w:type="dxa" w:w="1560"/>
             <w:tcMar>
-              <w:top w:w="50" w:type="dxa"/>
-              <w:bottom w:w="50" w:type="dxa"/>
-              <w:left w:w="70" w:type="dxa"/>
-              <w:right w:w="70" w:type="dxa"/>
+              <w:top w:w="35" w:type="dxa"/>
+              <w:bottom w:w="35" w:type="dxa"/>
+              <w:left w:w="50" w:type="dxa"/>
+              <w:right w:w="50" w:type="dxa"/>
             </w:tcMar>
           </w:tcPr>
           <w:p>
             <w:r>
               <w:rPr>
-                <w:sz w:val="15"/>
+                <w:sz w:val="13"/>
               </w:rPr>
               <w:t>Chicago</w:t>
             </w:r>
@@ -2352,16 +2352,16 @@
           <w:tcPr>
             <w:tcW w:type="dxa" w:w="1560"/>
             <w:tcMar>
-              <w:top w:w="50" w:type="dxa"/>
-              <w:bottom w:w="50" w:type="dxa"/>
-              <w:left w:w="70" w:type="dxa"/>
-              <w:right w:w="70" w:type="dxa"/>
+              <w:top w:w="35" w:type="dxa"/>
+              <w:bottom w:w="35" w:type="dxa"/>
+              <w:left w:w="50" w:type="dxa"/>
+              <w:right w:w="50" w:type="dxa"/>
             </w:tcMar>
           </w:tcPr>
           <w:p>
             <w:r>
               <w:rPr>
-                <w:sz w:val="15"/>
+                <w:sz w:val="13"/>
               </w:rPr>
               <w:t>Vegetation</w:t>
             </w:r>
@@ -2371,16 +2371,16 @@
           <w:tcPr>
             <w:tcW w:type="dxa" w:w="1560"/>
             <w:tcMar>
-              <w:top w:w="50" w:type="dxa"/>
-              <w:bottom w:w="50" w:type="dxa"/>
-              <w:left w:w="70" w:type="dxa"/>
-              <w:right w:w="70" w:type="dxa"/>
+              <w:top w:w="35" w:type="dxa"/>
+              <w:bottom w:w="35" w:type="dxa"/>
+              <w:left w:w="50" w:type="dxa"/>
+              <w:right w:w="50" w:type="dxa"/>
             </w:tcMar>
           </w:tcPr>
           <w:p>
             <w:r>
               <w:rPr>
-                <w:sz w:val="15"/>
+                <w:sz w:val="13"/>
               </w:rPr>
               <w:t>Chicago Urban Forest Tree Inventory (8 sidewalk Gleditsia triacanthos)</w:t>
             </w:r>
@@ -2390,16 +2390,16 @@
           <w:tcPr>
             <w:tcW w:type="dxa" w:w="1560"/>
             <w:tcMar>
-              <w:top w:w="50" w:type="dxa"/>
-              <w:bottom w:w="50" w:type="dxa"/>
-              <w:left w:w="70" w:type="dxa"/>
-              <w:right w:w="70" w:type="dxa"/>
+              <w:top w:w="35" w:type="dxa"/>
+              <w:bottom w:w="35" w:type="dxa"/>
+              <w:left w:w="50" w:type="dxa"/>
+              <w:right w:w="50" w:type="dxa"/>
             </w:tcMar>
           </w:tcPr>
           <w:p>
             <w:r>
               <w:rPr>
-                <w:sz w:val="15"/>
+                <w:sz w:val="13"/>
               </w:rPr>
               <w:t>https://data.cityofchicago.org/Parks-Recreation/Trees/</w:t>
             </w:r>
@@ -2409,16 +2409,16 @@
           <w:tcPr>
             <w:tcW w:type="dxa" w:w="1560"/>
             <w:tcMar>
-              <w:top w:w="50" w:type="dxa"/>
-              <w:bottom w:w="50" w:type="dxa"/>
-              <w:left w:w="70" w:type="dxa"/>
-              <w:right w:w="70" w:type="dxa"/>
+              <w:top w:w="35" w:type="dxa"/>
+              <w:bottom w:w="35" w:type="dxa"/>
+              <w:left w:w="50" w:type="dxa"/>
+              <w:right w:w="50" w:type="dxa"/>
             </w:tcMar>
           </w:tcPr>
           <w:p>
             <w:r>
               <w:rPr>
-                <w:sz w:val="15"/>
+                <w:sz w:val="13"/>
               </w:rPr>
               <w:t>Public Domain</w:t>
             </w:r>
@@ -2428,16 +2428,16 @@
           <w:tcPr>
             <w:tcW w:type="dxa" w:w="1560"/>
             <w:tcMar>
-              <w:top w:w="50" w:type="dxa"/>
-              <w:bottom w:w="50" w:type="dxa"/>
-              <w:left w:w="70" w:type="dxa"/>
-              <w:right w:w="70" w:type="dxa"/>
+              <w:top w:w="35" w:type="dxa"/>
+              <w:bottom w:w="35" w:type="dxa"/>
+              <w:left w:w="50" w:type="dxa"/>
+              <w:right w:w="50" w:type="dxa"/>
             </w:tcMar>
           </w:tcPr>
           <w:p>
             <w:r>
               <w:rPr>
-                <w:sz w:val="15"/>
+                <w:sz w:val="13"/>
               </w:rPr>
               <w:t>2026-10-13</w:t>
             </w:r>
@@ -2449,17 +2449,17 @@
           <w:tcPr>
             <w:tcW w:type="dxa" w:w="1560"/>
             <w:tcMar>
-              <w:top w:w="50" w:type="dxa"/>
-              <w:bottom w:w="50" w:type="dxa"/>
-              <w:left w:w="70" w:type="dxa"/>
-              <w:right w:w="70" w:type="dxa"/>
+              <w:top w:w="35" w:type="dxa"/>
+              <w:bottom w:w="35" w:type="dxa"/>
+              <w:left w:w="50" w:type="dxa"/>
+              <w:right w:w="50" w:type="dxa"/>
             </w:tcMar>
             <w:shd w:fill="FAFAFA"/>
           </w:tcPr>
           <w:p>
             <w:r>
               <w:rPr>
-                <w:sz w:val="15"/>
+                <w:sz w:val="13"/>
               </w:rPr>
               <w:t>Chicago</w:t>
             </w:r>
@@ -2469,17 +2469,17 @@
           <w:tcPr>
             <w:tcW w:type="dxa" w:w="1560"/>
             <w:tcMar>
-              <w:top w:w="50" w:type="dxa"/>
-              <w:bottom w:w="50" w:type="dxa"/>
-              <w:left w:w="70" w:type="dxa"/>
-              <w:right w:w="70" w:type="dxa"/>
+              <w:top w:w="35" w:type="dxa"/>
+              <w:bottom w:w="35" w:type="dxa"/>
+              <w:left w:w="50" w:type="dxa"/>
+              <w:right w:w="50" w:type="dxa"/>
             </w:tcMar>
             <w:shd w:fill="FAFAFA"/>
           </w:tcPr>
           <w:p>
             <w:r>
               <w:rPr>
-                <w:sz w:val="15"/>
+                <w:sz w:val="13"/>
               </w:rPr>
               <w:t>Weather</w:t>
             </w:r>
@@ -2489,17 +2489,17 @@
           <w:tcPr>
             <w:tcW w:type="dxa" w:w="1560"/>
             <w:tcMar>
-              <w:top w:w="50" w:type="dxa"/>
-              <w:bottom w:w="50" w:type="dxa"/>
-              <w:left w:w="70" w:type="dxa"/>
-              <w:right w:w="70" w:type="dxa"/>
+              <w:top w:w="35" w:type="dxa"/>
+              <w:bottom w:w="35" w:type="dxa"/>
+              <w:left w:w="50" w:type="dxa"/>
+              <w:right w:w="50" w:type="dxa"/>
             </w:tcMar>
             <w:shd w:fill="FAFAFA"/>
           </w:tcPr>
           <w:p>
             <w:r>
               <w:rPr>
-                <w:sz w:val="15"/>
+                <w:sz w:val="13"/>
               </w:rPr>
               <w:t>NOAA Local Climatological Data KORD (2024-07-15 Heatwave, peak Ta=33.8°C)</w:t>
             </w:r>
@@ -2509,17 +2509,17 @@
           <w:tcPr>
             <w:tcW w:type="dxa" w:w="1560"/>
             <w:tcMar>
-              <w:top w:w="50" w:type="dxa"/>
-              <w:bottom w:w="50" w:type="dxa"/>
-              <w:left w:w="70" w:type="dxa"/>
-              <w:right w:w="70" w:type="dxa"/>
+              <w:top w:w="35" w:type="dxa"/>
+              <w:bottom w:w="35" w:type="dxa"/>
+              <w:left w:w="50" w:type="dxa"/>
+              <w:right w:w="50" w:type="dxa"/>
             </w:tcMar>
             <w:shd w:fill="FAFAFA"/>
           </w:tcPr>
           <w:p>
             <w:r>
               <w:rPr>
-                <w:sz w:val="15"/>
+                <w:sz w:val="13"/>
               </w:rPr>
               <w:t>https://www.ncei.noaa.gov/cdo-web/</w:t>
             </w:r>
@@ -2529,17 +2529,17 @@
           <w:tcPr>
             <w:tcW w:type="dxa" w:w="1560"/>
             <w:tcMar>
-              <w:top w:w="50" w:type="dxa"/>
-              <w:bottom w:w="50" w:type="dxa"/>
-              <w:left w:w="70" w:type="dxa"/>
-              <w:right w:w="70" w:type="dxa"/>
+              <w:top w:w="35" w:type="dxa"/>
+              <w:bottom w:w="35" w:type="dxa"/>
+              <w:left w:w="50" w:type="dxa"/>
+              <w:right w:w="50" w:type="dxa"/>
             </w:tcMar>
             <w:shd w:fill="FAFAFA"/>
           </w:tcPr>
           <w:p>
             <w:r>
               <w:rPr>
-                <w:sz w:val="15"/>
+                <w:sz w:val="13"/>
               </w:rPr>
               <w:t>Open Access / NOAA</w:t>
             </w:r>
@@ -2549,17 +2549,17 @@
           <w:tcPr>
             <w:tcW w:type="dxa" w:w="1560"/>
             <w:tcMar>
-              <w:top w:w="50" w:type="dxa"/>
-              <w:bottom w:w="50" w:type="dxa"/>
-              <w:left w:w="70" w:type="dxa"/>
-              <w:right w:w="70" w:type="dxa"/>
+              <w:top w:w="35" w:type="dxa"/>
+              <w:bottom w:w="35" w:type="dxa"/>
+              <w:left w:w="50" w:type="dxa"/>
+              <w:right w:w="50" w:type="dxa"/>
             </w:tcMar>
             <w:shd w:fill="FAFAFA"/>
           </w:tcPr>
           <w:p>
             <w:r>
               <w:rPr>
-                <w:sz w:val="15"/>
+                <w:sz w:val="13"/>
               </w:rPr>
               <w:t>2026-10-13</w:t>
             </w:r>
@@ -2571,16 +2571,16 @@
           <w:tcPr>
             <w:tcW w:type="dxa" w:w="1560"/>
             <w:tcMar>
-              <w:top w:w="50" w:type="dxa"/>
-              <w:bottom w:w="50" w:type="dxa"/>
-              <w:left w:w="70" w:type="dxa"/>
-              <w:right w:w="70" w:type="dxa"/>
+              <w:top w:w="35" w:type="dxa"/>
+              <w:bottom w:w="35" w:type="dxa"/>
+              <w:left w:w="50" w:type="dxa"/>
+              <w:right w:w="50" w:type="dxa"/>
             </w:tcMar>
           </w:tcPr>
           <w:p>
             <w:r>
               <w:rPr>
-                <w:sz w:val="15"/>
+                <w:sz w:val="13"/>
               </w:rPr>
               <w:t>London</w:t>
             </w:r>
@@ -2590,16 +2590,16 @@
           <w:tcPr>
             <w:tcW w:type="dxa" w:w="1560"/>
             <w:tcMar>
-              <w:top w:w="50" w:type="dxa"/>
-              <w:bottom w:w="50" w:type="dxa"/>
-              <w:left w:w="70" w:type="dxa"/>
-              <w:right w:w="70" w:type="dxa"/>
+              <w:top w:w="35" w:type="dxa"/>
+              <w:bottom w:w="35" w:type="dxa"/>
+              <w:left w:w="50" w:type="dxa"/>
+              <w:right w:w="50" w:type="dxa"/>
             </w:tcMar>
           </w:tcPr>
           <w:p>
             <w:r>
               <w:rPr>
-                <w:sz w:val="15"/>
+                <w:sz w:val="13"/>
               </w:rPr>
               <w:t>Buildings</w:t>
             </w:r>
@@ -2609,16 +2609,16 @@
           <w:tcPr>
             <w:tcW w:type="dxa" w:w="1560"/>
             <w:tcMar>
-              <w:top w:w="50" w:type="dxa"/>
-              <w:bottom w:w="50" w:type="dxa"/>
-              <w:left w:w="70" w:type="dxa"/>
-              <w:right w:w="70" w:type="dxa"/>
+              <w:top w:w="35" w:type="dxa"/>
+              <w:bottom w:w="35" w:type="dxa"/>
+              <w:left w:w="50" w:type="dxa"/>
+              <w:right w:w="50" w:type="dxa"/>
             </w:tcMar>
           </w:tcPr>
           <w:p>
             <w:r>
               <w:rPr>
-                <w:sz w:val="15"/>
+                <w:sz w:val="13"/>
               </w:rPr>
               <w:t>OS Open Map Local / GLA 3D Building Heights</w:t>
             </w:r>
@@ -2628,16 +2628,16 @@
           <w:tcPr>
             <w:tcW w:type="dxa" w:w="1560"/>
             <w:tcMar>
-              <w:top w:w="50" w:type="dxa"/>
-              <w:bottom w:w="50" w:type="dxa"/>
-              <w:left w:w="70" w:type="dxa"/>
-              <w:right w:w="70" w:type="dxa"/>
+              <w:top w:w="35" w:type="dxa"/>
+              <w:bottom w:w="35" w:type="dxa"/>
+              <w:left w:w="50" w:type="dxa"/>
+              <w:right w:w="50" w:type="dxa"/>
             </w:tcMar>
           </w:tcPr>
           <w:p>
             <w:r>
               <w:rPr>
-                <w:sz w:val="15"/>
+                <w:sz w:val="13"/>
               </w:rPr>
               <w:t>https://osdatahub.os.uk/</w:t>
             </w:r>
@@ -2647,16 +2647,16 @@
           <w:tcPr>
             <w:tcW w:type="dxa" w:w="1560"/>
             <w:tcMar>
-              <w:top w:w="50" w:type="dxa"/>
-              <w:bottom w:w="50" w:type="dxa"/>
-              <w:left w:w="70" w:type="dxa"/>
-              <w:right w:w="70" w:type="dxa"/>
+              <w:top w:w="35" w:type="dxa"/>
+              <w:bottom w:w="35" w:type="dxa"/>
+              <w:left w:w="50" w:type="dxa"/>
+              <w:right w:w="50" w:type="dxa"/>
             </w:tcMar>
           </w:tcPr>
           <w:p>
             <w:r>
               <w:rPr>
-                <w:sz w:val="15"/>
+                <w:sz w:val="13"/>
               </w:rPr>
               <w:t>OGL v3.0</w:t>
             </w:r>
@@ -2666,16 +2666,16 @@
           <w:tcPr>
             <w:tcW w:type="dxa" w:w="1560"/>
             <w:tcMar>
-              <w:top w:w="50" w:type="dxa"/>
-              <w:bottom w:w="50" w:type="dxa"/>
-              <w:left w:w="70" w:type="dxa"/>
-              <w:right w:w="70" w:type="dxa"/>
+              <w:top w:w="35" w:type="dxa"/>
+              <w:bottom w:w="35" w:type="dxa"/>
+              <w:left w:w="50" w:type="dxa"/>
+              <w:right w:w="50" w:type="dxa"/>
             </w:tcMar>
           </w:tcPr>
           <w:p>
             <w:r>
               <w:rPr>
-                <w:sz w:val="15"/>
+                <w:sz w:val="13"/>
               </w:rPr>
               <w:t>2026-10-13</w:t>
             </w:r>
@@ -2687,17 +2687,17 @@
           <w:tcPr>
             <w:tcW w:type="dxa" w:w="1560"/>
             <w:tcMar>
-              <w:top w:w="50" w:type="dxa"/>
-              <w:bottom w:w="50" w:type="dxa"/>
-              <w:left w:w="70" w:type="dxa"/>
-              <w:right w:w="70" w:type="dxa"/>
+              <w:top w:w="35" w:type="dxa"/>
+              <w:bottom w:w="35" w:type="dxa"/>
+              <w:left w:w="50" w:type="dxa"/>
+              <w:right w:w="50" w:type="dxa"/>
             </w:tcMar>
             <w:shd w:fill="FAFAFA"/>
           </w:tcPr>
           <w:p>
             <w:r>
               <w:rPr>
-                <w:sz w:val="15"/>
+                <w:sz w:val="13"/>
               </w:rPr>
               <w:t>London</w:t>
             </w:r>
@@ -2707,17 +2707,17 @@
           <w:tcPr>
             <w:tcW w:type="dxa" w:w="1560"/>
             <w:tcMar>
-              <w:top w:w="50" w:type="dxa"/>
-              <w:bottom w:w="50" w:type="dxa"/>
-              <w:left w:w="70" w:type="dxa"/>
-              <w:right w:w="70" w:type="dxa"/>
+              <w:top w:w="35" w:type="dxa"/>
+              <w:bottom w:w="35" w:type="dxa"/>
+              <w:left w:w="50" w:type="dxa"/>
+              <w:right w:w="50" w:type="dxa"/>
             </w:tcMar>
             <w:shd w:fill="FAFAFA"/>
           </w:tcPr>
           <w:p>
             <w:r>
               <w:rPr>
-                <w:sz w:val="15"/>
+                <w:sz w:val="13"/>
               </w:rPr>
               <w:t>Terrain</w:t>
             </w:r>
@@ -2727,17 +2727,17 @@
           <w:tcPr>
             <w:tcW w:type="dxa" w:w="1560"/>
             <w:tcMar>
-              <w:top w:w="50" w:type="dxa"/>
-              <w:bottom w:w="50" w:type="dxa"/>
-              <w:left w:w="70" w:type="dxa"/>
-              <w:right w:w="70" w:type="dxa"/>
+              <w:top w:w="35" w:type="dxa"/>
+              <w:bottom w:w="35" w:type="dxa"/>
+              <w:left w:w="50" w:type="dxa"/>
+              <w:right w:w="50" w:type="dxa"/>
             </w:tcMar>
             <w:shd w:fill="FAFAFA"/>
           </w:tcPr>
           <w:p>
             <w:r>
               <w:rPr>
-                <w:sz w:val="15"/>
+                <w:sz w:val="13"/>
               </w:rPr>
               <w:t>Environment Agency LiDAR Composite DTM 1m</w:t>
             </w:r>
@@ -2747,17 +2747,17 @@
           <w:tcPr>
             <w:tcW w:type="dxa" w:w="1560"/>
             <w:tcMar>
-              <w:top w:w="50" w:type="dxa"/>
-              <w:bottom w:w="50" w:type="dxa"/>
-              <w:left w:w="70" w:type="dxa"/>
-              <w:right w:w="70" w:type="dxa"/>
+              <w:top w:w="35" w:type="dxa"/>
+              <w:bottom w:w="35" w:type="dxa"/>
+              <w:left w:w="50" w:type="dxa"/>
+              <w:right w:w="50" w:type="dxa"/>
             </w:tcMar>
             <w:shd w:fill="FAFAFA"/>
           </w:tcPr>
           <w:p>
             <w:r>
               <w:rPr>
-                <w:sz w:val="15"/>
+                <w:sz w:val="13"/>
               </w:rPr>
               <w:t>https://environment.data.gov.uk/</w:t>
             </w:r>
@@ -2767,17 +2767,17 @@
           <w:tcPr>
             <w:tcW w:type="dxa" w:w="1560"/>
             <w:tcMar>
-              <w:top w:w="50" w:type="dxa"/>
-              <w:bottom w:w="50" w:type="dxa"/>
-              <w:left w:w="70" w:type="dxa"/>
-              <w:right w:w="70" w:type="dxa"/>
+              <w:top w:w="35" w:type="dxa"/>
+              <w:bottom w:w="35" w:type="dxa"/>
+              <w:left w:w="50" w:type="dxa"/>
+              <w:right w:w="50" w:type="dxa"/>
             </w:tcMar>
             <w:shd w:fill="FAFAFA"/>
           </w:tcPr>
           <w:p>
             <w:r>
               <w:rPr>
-                <w:sz w:val="15"/>
+                <w:sz w:val="13"/>
               </w:rPr>
               <w:t>OGL v3.0</w:t>
             </w:r>
@@ -2787,17 +2787,17 @@
           <w:tcPr>
             <w:tcW w:type="dxa" w:w="1560"/>
             <w:tcMar>
-              <w:top w:w="50" w:type="dxa"/>
-              <w:bottom w:w="50" w:type="dxa"/>
-              <w:left w:w="70" w:type="dxa"/>
-              <w:right w:w="70" w:type="dxa"/>
+              <w:top w:w="35" w:type="dxa"/>
+              <w:bottom w:w="35" w:type="dxa"/>
+              <w:left w:w="50" w:type="dxa"/>
+              <w:right w:w="50" w:type="dxa"/>
             </w:tcMar>
             <w:shd w:fill="FAFAFA"/>
           </w:tcPr>
           <w:p>
             <w:r>
               <w:rPr>
-                <w:sz w:val="15"/>
+                <w:sz w:val="13"/>
               </w:rPr>
               <w:t>2026-10-13</w:t>
             </w:r>
@@ -2809,16 +2809,16 @@
           <w:tcPr>
             <w:tcW w:type="dxa" w:w="1560"/>
             <w:tcMar>
-              <w:top w:w="50" w:type="dxa"/>
-              <w:bottom w:w="50" w:type="dxa"/>
-              <w:left w:w="70" w:type="dxa"/>
-              <w:right w:w="70" w:type="dxa"/>
+              <w:top w:w="35" w:type="dxa"/>
+              <w:bottom w:w="35" w:type="dxa"/>
+              <w:left w:w="50" w:type="dxa"/>
+              <w:right w:w="50" w:type="dxa"/>
             </w:tcMar>
           </w:tcPr>
           <w:p>
             <w:r>
               <w:rPr>
-                <w:sz w:val="15"/>
+                <w:sz w:val="13"/>
               </w:rPr>
               <w:t>London</w:t>
             </w:r>
@@ -2828,16 +2828,16 @@
           <w:tcPr>
             <w:tcW w:type="dxa" w:w="1560"/>
             <w:tcMar>
-              <w:top w:w="50" w:type="dxa"/>
-              <w:bottom w:w="50" w:type="dxa"/>
-              <w:left w:w="70" w:type="dxa"/>
-              <w:right w:w="70" w:type="dxa"/>
+              <w:top w:w="35" w:type="dxa"/>
+              <w:bottom w:w="35" w:type="dxa"/>
+              <w:left w:w="50" w:type="dxa"/>
+              <w:right w:w="50" w:type="dxa"/>
             </w:tcMar>
           </w:tcPr>
           <w:p>
             <w:r>
               <w:rPr>
-                <w:sz w:val="15"/>
+                <w:sz w:val="13"/>
               </w:rPr>
               <w:t>Vegetation</w:t>
             </w:r>
@@ -2847,16 +2847,16 @@
           <w:tcPr>
             <w:tcW w:type="dxa" w:w="1560"/>
             <w:tcMar>
-              <w:top w:w="50" w:type="dxa"/>
-              <w:bottom w:w="50" w:type="dxa"/>
-              <w:left w:w="70" w:type="dxa"/>
-              <w:right w:w="70" w:type="dxa"/>
+              <w:top w:w="35" w:type="dxa"/>
+              <w:bottom w:w="35" w:type="dxa"/>
+              <w:left w:w="50" w:type="dxa"/>
+              <w:right w:w="50" w:type="dxa"/>
             </w:tcMar>
           </w:tcPr>
           <w:p>
             <w:r>
               <w:rPr>
-                <w:sz w:val="15"/>
+                <w:sz w:val="13"/>
               </w:rPr>
               <w:t>RBKC Street Tree Cadaster (14 Platanus x hispanica boulevard trees)</w:t>
             </w:r>
@@ -2866,16 +2866,16 @@
           <w:tcPr>
             <w:tcW w:type="dxa" w:w="1560"/>
             <w:tcMar>
-              <w:top w:w="50" w:type="dxa"/>
-              <w:bottom w:w="50" w:type="dxa"/>
-              <w:left w:w="70" w:type="dxa"/>
-              <w:right w:w="70" w:type="dxa"/>
+              <w:top w:w="35" w:type="dxa"/>
+              <w:bottom w:w="35" w:type="dxa"/>
+              <w:left w:w="50" w:type="dxa"/>
+              <w:right w:w="50" w:type="dxa"/>
             </w:tcMar>
           </w:tcPr>
           <w:p>
             <w:r>
               <w:rPr>
-                <w:sz w:val="15"/>
+                <w:sz w:val="13"/>
               </w:rPr>
               <w:t>https://opendata.rbkc.gov.uk/</w:t>
             </w:r>
@@ -2885,16 +2885,16 @@
           <w:tcPr>
             <w:tcW w:type="dxa" w:w="1560"/>
             <w:tcMar>
-              <w:top w:w="50" w:type="dxa"/>
-              <w:bottom w:w="50" w:type="dxa"/>
-              <w:left w:w="70" w:type="dxa"/>
-              <w:right w:w="70" w:type="dxa"/>
+              <w:top w:w="35" w:type="dxa"/>
+              <w:bottom w:w="35" w:type="dxa"/>
+              <w:left w:w="50" w:type="dxa"/>
+              <w:right w:w="50" w:type="dxa"/>
             </w:tcMar>
           </w:tcPr>
           <w:p>
             <w:r>
               <w:rPr>
-                <w:sz w:val="15"/>
+                <w:sz w:val="13"/>
               </w:rPr>
               <w:t>OGL v3.0</w:t>
             </w:r>
@@ -2904,16 +2904,16 @@
           <w:tcPr>
             <w:tcW w:type="dxa" w:w="1560"/>
             <w:tcMar>
-              <w:top w:w="50" w:type="dxa"/>
-              <w:bottom w:w="50" w:type="dxa"/>
-              <w:left w:w="70" w:type="dxa"/>
-              <w:right w:w="70" w:type="dxa"/>
+              <w:top w:w="35" w:type="dxa"/>
+              <w:bottom w:w="35" w:type="dxa"/>
+              <w:left w:w="50" w:type="dxa"/>
+              <w:right w:w="50" w:type="dxa"/>
             </w:tcMar>
           </w:tcPr>
           <w:p>
             <w:r>
               <w:rPr>
-                <w:sz w:val="15"/>
+                <w:sz w:val="13"/>
               </w:rPr>
               <w:t>2026-10-13</w:t>
             </w:r>
@@ -2925,17 +2925,17 @@
           <w:tcPr>
             <w:tcW w:type="dxa" w:w="1560"/>
             <w:tcMar>
-              <w:top w:w="50" w:type="dxa"/>
-              <w:bottom w:w="50" w:type="dxa"/>
-              <w:left w:w="70" w:type="dxa"/>
-              <w:right w:w="70" w:type="dxa"/>
+              <w:top w:w="35" w:type="dxa"/>
+              <w:bottom w:w="35" w:type="dxa"/>
+              <w:left w:w="50" w:type="dxa"/>
+              <w:right w:w="50" w:type="dxa"/>
             </w:tcMar>
             <w:shd w:fill="FAFAFA"/>
           </w:tcPr>
           <w:p>
             <w:r>
               <w:rPr>
-                <w:sz w:val="15"/>
+                <w:sz w:val="13"/>
               </w:rPr>
               <w:t>London</w:t>
             </w:r>
@@ -2945,17 +2945,17 @@
           <w:tcPr>
             <w:tcW w:type="dxa" w:w="1560"/>
             <w:tcMar>
-              <w:top w:w="50" w:type="dxa"/>
-              <w:bottom w:w="50" w:type="dxa"/>
-              <w:left w:w="70" w:type="dxa"/>
-              <w:right w:w="70" w:type="dxa"/>
+              <w:top w:w="35" w:type="dxa"/>
+              <w:bottom w:w="35" w:type="dxa"/>
+              <w:left w:w="50" w:type="dxa"/>
+              <w:right w:w="50" w:type="dxa"/>
             </w:tcMar>
             <w:shd w:fill="FAFAFA"/>
           </w:tcPr>
           <w:p>
             <w:r>
               <w:rPr>
-                <w:sz w:val="15"/>
+                <w:sz w:val="13"/>
               </w:rPr>
               <w:t>Weather</w:t>
             </w:r>
@@ -2965,17 +2965,17 @@
           <w:tcPr>
             <w:tcW w:type="dxa" w:w="1560"/>
             <w:tcMar>
-              <w:top w:w="50" w:type="dxa"/>
-              <w:bottom w:w="50" w:type="dxa"/>
-              <w:left w:w="70" w:type="dxa"/>
-              <w:right w:w="70" w:type="dxa"/>
+              <w:top w:w="35" w:type="dxa"/>
+              <w:bottom w:w="35" w:type="dxa"/>
+              <w:left w:w="50" w:type="dxa"/>
+              <w:right w:w="50" w:type="dxa"/>
             </w:tcMar>
             <w:shd w:fill="FAFAFA"/>
           </w:tcPr>
           <w:p>
             <w:r>
               <w:rPr>
-                <w:sz w:val="15"/>
+                <w:sz w:val="13"/>
               </w:rPr>
               <w:t>UK Met Office MIDAS Open Heathrow EGLL (2024-07-19 Heatwave, peak Ta=32.2°C)</w:t>
             </w:r>
@@ -2985,17 +2985,17 @@
           <w:tcPr>
             <w:tcW w:type="dxa" w:w="1560"/>
             <w:tcMar>
-              <w:top w:w="50" w:type="dxa"/>
-              <w:bottom w:w="50" w:type="dxa"/>
-              <w:left w:w="70" w:type="dxa"/>
-              <w:right w:w="70" w:type="dxa"/>
+              <w:top w:w="35" w:type="dxa"/>
+              <w:bottom w:w="35" w:type="dxa"/>
+              <w:left w:w="50" w:type="dxa"/>
+              <w:right w:w="50" w:type="dxa"/>
             </w:tcMar>
             <w:shd w:fill="FAFAFA"/>
           </w:tcPr>
           <w:p>
             <w:r>
               <w:rPr>
-                <w:sz w:val="15"/>
+                <w:sz w:val="13"/>
               </w:rPr>
               <w:t>https://catalogue.ceda.ac.uk/</w:t>
             </w:r>
@@ -3005,17 +3005,17 @@
           <w:tcPr>
             <w:tcW w:type="dxa" w:w="1560"/>
             <w:tcMar>
-              <w:top w:w="50" w:type="dxa"/>
-              <w:bottom w:w="50" w:type="dxa"/>
-              <w:left w:w="70" w:type="dxa"/>
-              <w:right w:w="70" w:type="dxa"/>
+              <w:top w:w="35" w:type="dxa"/>
+              <w:bottom w:w="35" w:type="dxa"/>
+              <w:left w:w="50" w:type="dxa"/>
+              <w:right w:w="50" w:type="dxa"/>
             </w:tcMar>
             <w:shd w:fill="FAFAFA"/>
           </w:tcPr>
           <w:p>
             <w:r>
               <w:rPr>
-                <w:sz w:val="15"/>
+                <w:sz w:val="13"/>
               </w:rPr>
               <w:t>OGL v3.0</w:t>
             </w:r>
@@ -3025,17 +3025,17 @@
           <w:tcPr>
             <w:tcW w:type="dxa" w:w="1560"/>
             <w:tcMar>
-              <w:top w:w="50" w:type="dxa"/>
-              <w:bottom w:w="50" w:type="dxa"/>
-              <w:left w:w="70" w:type="dxa"/>
-              <w:right w:w="70" w:type="dxa"/>
+              <w:top w:w="35" w:type="dxa"/>
+              <w:bottom w:w="35" w:type="dxa"/>
+              <w:left w:w="50" w:type="dxa"/>
+              <w:right w:w="50" w:type="dxa"/>
             </w:tcMar>
             <w:shd w:fill="FAFAFA"/>
           </w:tcPr>
           <w:p>
             <w:r>
               <w:rPr>
-                <w:sz w:val="15"/>
+                <w:sz w:val="13"/>
               </w:rPr>
               <w:t>2026-10-13</w:t>
             </w:r>

</xml_diff>

<commit_message>
Update Subsection II.B with humanized text verbatim
</commit_message>
<xml_diff>
--- a/docs/solaraeus_manuscript.docx
+++ b/docs/solaraeus_manuscript.docx
@@ -1409,12 +1409,12 @@
           <w:color w:val="003366"/>
           <w:sz w:val="22"/>
         </w:rPr>
-        <w:t>2.2 GPU Acceleration and Precomputed Transport Architectures</w:t>
+        <w:t>2.2 GPU Acceleration and Precomputed Transport Models</w:t>
       </w:r>
     </w:p>
     <w:p>
       <w:r>
-        <w:t>To accelerate large simulations, recent tools leverage GPU parallelism. Kamath et al. (2026) developed SOLWEIG-GPU for city-scale comfort modeling via CUDA ray marching, while Mei et al. (2025) introduced GUST1.0 for GPU-based surface energy balances, and Nguyen et al. (2023) applied parallel geospatial algorithms. In computer graphics, Freude et al. (2023, 2025) used precomputed radiative transport matrices to simulate dynamic thermal exchange in real time. However, precomputed matrices assume stationary geometry; adding even a single canopy alters the scene and invalidates the entire matrix. Existing GPU frameworks thus accelerate full recalculations rather than incrementally reusing unaffected cells.</w:t>
+        <w:t>To speed up big simulations, recent approaches have made use of GPU parallelization. Kamath et al. (2026) created SOLWEIG-GPU for comfort simulation on the city scale through CUDA ray marching, whereas Mei et al. (2025) created GUST1.0 for surface energy balance calculations with GPU, and Nguyen et al. (2023) employed geospatial parallel algorithms. In computer graphics, Freude et al. (2023, 2025) utilized pre-computed transport matrices of radiative transport in order to simulate dynamic thermal exchange in real-time. Nevertheless, pre-computed matrices assume static geometry; by adding even just one canopy, the whole model becomes outdated. Hence, existing GPU approaches accelerate full recalculation, but do not utilize unaffected cells incrementally.</w:t>
       </w:r>
     </w:p>
     <w:p>

</xml_diff>

<commit_message>
Update all figure and table captions to humanized versions
</commit_message>
<xml_diff>
--- a/docs/solaraeus_manuscript.docx
+++ b/docs/solaraeus_manuscript.docx
@@ -1378,7 +1378,7 @@
           <w:i/>
           <w:sz w:val="17"/>
         </w:rPr>
-        <w:t>Table 1. Systematic literature review of microclimate modeling, GPU acceleration, and optimization frameworks.</w:t>
+        <w:t>Table 1. Systematic literature review of microclimate modelling, GPU acceleration, and optimization platforms.</w:t>
       </w:r>
     </w:p>
     <w:p>
@@ -3052,7 +3052,7 @@
           <w:i/>
           <w:sz w:val="17"/>
         </w:rPr>
-        <w:t>Table 2. Geospatial and meteorological data specifications across Berlin, Chicago, and London case studies.</w:t>
+        <w:t>Table 2. Geospatial and meteorological data characteristics in Berlin, Chicago, and London example studies.</w:t>
       </w:r>
     </w:p>
     <w:p>
@@ -3131,7 +3131,7 @@
           <w:i/>
           <w:sz w:val="17"/>
         </w:rPr>
-        <w:t>Figure 1. End-to-end methodology workflow block diagram of the Solaraeus microclimate platform.</w:t>
+        <w:t>Figure 1. Block diagram of methodology pipeline for Solaraeus microclimate platform end-to-end.</w:t>
       </w:r>
     </w:p>
     <w:p>
@@ -3197,7 +3197,7 @@
           <w:i/>
           <w:sz w:val="17"/>
         </w:rPr>
-        <w:t>Figure 2. Module-level system architecture and data interface diagram.</w:t>
+        <w:t>Figure 2. System architecture with modules diagram and interface diagram.</w:t>
       </w:r>
     </w:p>
     <w:p>
@@ -3269,7 +3269,7 @@
           <w:i/>
           <w:sz w:val="17"/>
         </w:rPr>
-        <w:t>Figure 3. Incremental update operational flowchart delineating proved error certificate stages from empirical components.</w:t>
+        <w:t>Figure 3. Flow chart for incremental update process with proved error certificate steps from empirical components.</w:t>
       </w:r>
     </w:p>
     <w:p>
@@ -3335,7 +3335,7 @@
           <w:i/>
           <w:sz w:val="17"/>
         </w:rPr>
-        <w:t>Figure 4. Active learning Bayesian optimization loop with surrogate training and full-physics verification.</w:t>
+        <w:t>Figure 4. Active learning process of Bayesian optimization using training of surrogate model and validation through full physics.</w:t>
       </w:r>
     </w:p>
     <w:p>
@@ -3414,7 +3414,7 @@
           <w:i/>
           <w:sz w:val="17"/>
         </w:rPr>
-        <w:t>Figure 5. Spatial layouts, building heights, tree canopies, and cartographic projections for Berlin (a), Chicago (b), and London (c).</w:t>
+        <w:t>Figure 5. Geometries of spatial configuration, buildings, tree canopies, and projections for Berlin (a), Chicago (b), and London (c).</w:t>
       </w:r>
     </w:p>
     <w:p>
@@ -3480,7 +3480,7 @@
           <w:i/>
           <w:sz w:val="17"/>
         </w:rPr>
-        <w:t>Figure 6. Parity scatter plot of Solaraeus predicted Tmrt versus reference SOLWEIG across 900 street receptor cells.</w:t>
+        <w:t>Figure 6. Parity plot of Solaraeus predicted Tmrt and reference SOLWEIG predictions on 900 street receptors.</w:t>
       </w:r>
     </w:p>
     <w:p>
@@ -3546,7 +3546,7 @@
           <w:i/>
           <w:sz w:val="17"/>
         </w:rPr>
-        <w:t>Figure 7. Logarithmic histogram of per-cell temperature error across adversarial stress tests relative to the 0.50 K declared bound.</w:t>
+        <w:t>Figure 7. Logarithmic histogram of per-cell temperature prediction error under adversarial setting versus the 0.50 K bound claimed.</w:t>
       </w:r>
     </w:p>
     <w:p>
@@ -3612,7 +3612,7 @@
           <w:i/>
           <w:sz w:val="17"/>
         </w:rPr>
-        <w:t>Figure 8. Latency comparison across four computational modes on an NVIDIA RTX 4050 GPU across three domain scales.</w:t>
+        <w:t>Figure 8. Comparison of latency in four computational settings in an NVIDIA RTX 4050 GPU in three domains.</w:t>
       </w:r>
     </w:p>
     <w:tbl>
@@ -4120,7 +4120,7 @@
           <w:i/>
           <w:sz w:val="17"/>
         </w:rPr>
-        <w:t>Table 3. Computational execution latency and acceleration factors across domain scales (NVIDIA RTX 4050).</w:t>
+        <w:t>Table 3. Computational execution delay and acceleration ratios across domains (NVIDIA RTX 4050).</w:t>
       </w:r>
     </w:p>
     <w:p>
@@ -4186,7 +4186,7 @@
           <w:i/>
           <w:sz w:val="17"/>
         </w:rPr>
-        <w:t>Figure 9. Optimization convergence trajectories across 50 simulation evaluations for four algorithmic strategies.</w:t>
+        <w:t>Figure 9. Convergence plots for four optimization techniques for 50 simulation iterations.</w:t>
       </w:r>
     </w:p>
     <w:tbl>
@@ -4706,7 +4706,7 @@
           <w:i/>
           <w:sz w:val="17"/>
         </w:rPr>
-        <w:t>Table 4. Quantitative optimization performance comparison across methodologies (Budget = 50 Physics Evaluations).</w:t>
+        <w:t>Table 4. Optimization efficiency statistical analysis across strategies (Cost = 50 Physics Evaluations).</w:t>
       </w:r>
     </w:p>
     <w:p>
@@ -4775,7 +4775,7 @@
           <w:i/>
           <w:sz w:val="17"/>
         </w:rPr>
-        <w:t>Figure 10. Spatial distributions of baseline Tmrt (a), optimised Tmrt (b), and cooling delta ΔTmrt (c) on the Berlin Friedrichstraße corridor.</w:t>
+        <w:t>Figure 10. Baseline distribution of Tmrt (a), optimized Tmrt (b), and cooling delta ΔTmrt (c) on Berlin Friedrichstraße street canyon.</w:t>
       </w:r>
     </w:p>
     <w:tbl>
@@ -5300,7 +5300,7 @@
           <w:i/>
           <w:sz w:val="17"/>
         </w:rPr>
-        <w:t>Table 5. Before/after microclimatic performance and multi-city morphological replication comparison.</w:t>
+        <w:t>Table 5. Pre/post microclimatic efficiency and multiple cities morphology replica analysis.</w:t>
       </w:r>
     </w:p>
     <w:p>

</xml_diff>